<commit_message>
reflexions y preparation de 12/01/2026
</commit_message>
<xml_diff>
--- a/02-literature/TD2-Articles.docx
+++ b/02-literature/TD2-Articles.docx
@@ -1,6 +1,6 @@
 
 <file path=word/document.xml><?xml version="1.0" encoding="utf-8"?>
-<w:document xmlns:wpc="http://schemas.microsoft.com/office/word/2010/wordprocessingCanvas" xmlns:cx="http://schemas.microsoft.com/office/drawing/2014/chartex" xmlns:cx1="http://schemas.microsoft.com/office/drawing/2015/9/8/chartex" xmlns:cx2="http://schemas.microsoft.com/office/drawing/2015/10/21/chartex" xmlns:cx3="http://schemas.microsoft.com/office/drawing/2016/5/9/chartex" xmlns:cx4="http://schemas.microsoft.com/office/drawing/2016/5/10/chartex" xmlns:cx5="http://schemas.microsoft.com/office/drawing/2016/5/11/chartex" xmlns:cx6="http://schemas.microsoft.com/office/drawing/2016/5/12/chartex" xmlns:cx7="http://schemas.microsoft.com/office/drawing/2016/5/13/chartex" xmlns:cx8="http://schemas.microsoft.com/office/drawing/2016/5/14/chartex" xmlns:mc="http://schemas.openxmlformats.org/markup-compatibility/2006" xmlns:aink="http://schemas.microsoft.com/office/drawing/2016/ink" xmlns:am3d="http://schemas.microsoft.com/office/drawing/2017/model3d" xmlns:o="urn:schemas-microsoft-com:office:office" xmlns:oel="http://schemas.microsoft.com/office/2019/extlst" xmlns:r="http://schemas.openxmlformats.org/officeDocument/2006/relationships" xmlns:m="http://schemas.openxmlformats.org/officeDocument/2006/math" xmlns:v="urn:schemas-microsoft-com:vml" xmlns:wp14="http://schemas.microsoft.com/office/word/2010/wordprocessingDrawing" xmlns:wp="http://schemas.openxmlformats.org/drawingml/2006/wordprocessingDrawing" xmlns:w10="urn:schemas-microsoft-com:office:word" xmlns:w="http://schemas.openxmlformats.org/wordprocessingml/2006/main" xmlns:w14="http://schemas.microsoft.com/office/word/2010/wordml" xmlns:w15="http://schemas.microsoft.com/office/word/2012/wordml" xmlns:w16cex="http://schemas.microsoft.com/office/word/2018/wordml/cex" xmlns:w16cid="http://schemas.microsoft.com/office/word/2016/wordml/cid" xmlns:w16="http://schemas.microsoft.com/office/word/2018/wordml" xmlns:w16du="http://schemas.microsoft.com/office/word/2023/wordml/word16du" xmlns:w16sdtdh="http://schemas.microsoft.com/office/word/2020/wordml/sdtdatahash" xmlns:w16se="http://schemas.microsoft.com/office/word/2015/wordml/symex" xmlns:wpg="http://schemas.microsoft.com/office/word/2010/wordprocessingGroup" xmlns:wpi="http://schemas.microsoft.com/office/word/2010/wordprocessingInk" xmlns:wne="http://schemas.microsoft.com/office/word/2006/wordml" xmlns:wps="http://schemas.microsoft.com/office/word/2010/wordprocessingShape" mc:Ignorable="w14 w15 w16se w16cid w16 w16cex w16sdtdh w16du wp14">
+<w:document xmlns:wpc="http://schemas.microsoft.com/office/word/2010/wordprocessingCanvas" xmlns:cx="http://schemas.microsoft.com/office/drawing/2014/chartex" xmlns:cx1="http://schemas.microsoft.com/office/drawing/2015/9/8/chartex" xmlns:cx2="http://schemas.microsoft.com/office/drawing/2015/10/21/chartex" xmlns:cx3="http://schemas.microsoft.com/office/drawing/2016/5/9/chartex" xmlns:cx4="http://schemas.microsoft.com/office/drawing/2016/5/10/chartex" xmlns:cx5="http://schemas.microsoft.com/office/drawing/2016/5/11/chartex" xmlns:cx6="http://schemas.microsoft.com/office/drawing/2016/5/12/chartex" xmlns:cx7="http://schemas.microsoft.com/office/drawing/2016/5/13/chartex" xmlns:cx8="http://schemas.microsoft.com/office/drawing/2016/5/14/chartex" xmlns:mc="http://schemas.openxmlformats.org/markup-compatibility/2006" xmlns:aink="http://schemas.microsoft.com/office/drawing/2016/ink" xmlns:am3d="http://schemas.microsoft.com/office/drawing/2017/model3d" xmlns:o="urn:schemas-microsoft-com:office:office" xmlns:oel="http://schemas.microsoft.com/office/2019/extlst" xmlns:r="http://schemas.openxmlformats.org/officeDocument/2006/relationships" xmlns:m="http://schemas.openxmlformats.org/officeDocument/2006/math" xmlns:v="urn:schemas-microsoft-com:vml" xmlns:wp14="http://schemas.microsoft.com/office/word/2010/wordprocessingDrawing" xmlns:wp="http://schemas.openxmlformats.org/drawingml/2006/wordprocessingDrawing" xmlns:w10="urn:schemas-microsoft-com:office:word" xmlns:w="http://schemas.openxmlformats.org/wordprocessingml/2006/main" xmlns:w14="http://schemas.microsoft.com/office/word/2010/wordml" xmlns:w15="http://schemas.microsoft.com/office/word/2012/wordml" xmlns:w16cex="http://schemas.microsoft.com/office/word/2018/wordml/cex" xmlns:w16cid="http://schemas.microsoft.com/office/word/2016/wordml/cid" xmlns:w16="http://schemas.microsoft.com/office/word/2018/wordml" xmlns:w16du="http://schemas.microsoft.com/office/word/2023/wordml/word16du" xmlns:w16sdtdh="http://schemas.microsoft.com/office/word/2020/wordml/sdtdatahash" xmlns:w16sdtfl="http://schemas.microsoft.com/office/word/2024/wordml/sdtformatlock" xmlns:w16se="http://schemas.microsoft.com/office/word/2015/wordml/symex" xmlns:wpg="http://schemas.microsoft.com/office/word/2010/wordprocessingGroup" xmlns:wpi="http://schemas.microsoft.com/office/word/2010/wordprocessingInk" xmlns:wne="http://schemas.microsoft.com/office/word/2006/wordml" xmlns:wps="http://schemas.microsoft.com/office/word/2010/wordprocessingShape" mc:Ignorable="w14 w15 w16se w16cid w16 w16cex w16sdtdh w16sdtfl w16du wp14">
   <w:body>
     <w:p>
       <w:pPr>
@@ -34,7 +34,7 @@
           <w:noProof/>
         </w:rPr>
         <w:drawing>
-          <wp:anchor distT="0" distB="0" distL="114300" distR="114300" simplePos="0" relativeHeight="251659264" behindDoc="0" locked="0" layoutInCell="1" allowOverlap="1" wp14:anchorId="6D70CE63" wp14:editId="01523F4B">
+          <wp:anchor distT="0" distB="0" distL="114300" distR="114300" simplePos="0" relativeHeight="251659264" behindDoc="0" locked="0" layoutInCell="1" allowOverlap="1" wp14:anchorId="6D70CE63" wp14:editId="4696C133">
             <wp:simplePos x="0" y="0"/>
             <wp:positionH relativeFrom="column">
               <wp:posOffset>5715</wp:posOffset>
@@ -1175,7 +1175,7 @@
           <w:rFonts w:ascii="Garamond" w:hAnsi="Garamond" w:cs="Arial"/>
           <w:lang w:val="en-US"/>
         </w:rPr>
-        <w:t>Language: ___</w:t>
+        <w:t xml:space="preserve">Language: </w:t>
       </w:r>
     </w:p>
     <w:p>
@@ -1202,7 +1202,7 @@
           <w:rFonts w:ascii="Garamond" w:hAnsi="Garamond" w:cs="Arial"/>
           <w:lang w:val="en-US"/>
         </w:rPr>
-        <w:t>:      ____</w:t>
+        <w:t xml:space="preserve">:   </w:t>
       </w:r>
     </w:p>
     <w:p>
@@ -1222,17 +1222,8 @@
           <w:rFonts w:ascii="Garamond" w:hAnsi="Garamond" w:cs="Arial"/>
           <w:lang w:val="en-US"/>
         </w:rPr>
-        <w:t>Document Type:  _____</w:t>
-      </w:r>
-    </w:p>
-    <w:p>
-      <w:pPr>
-        <w:pStyle w:val="Standard"/>
-        <w:rPr>
-          <w:rFonts w:ascii="Garamond" w:hAnsi="Garamond" w:cs="Arial"/>
-          <w:lang w:val="en-US"/>
-        </w:rPr>
-      </w:pPr>
+        <w:t xml:space="preserve">Document Type:  </w:t>
+      </w:r>
     </w:p>
     <w:p>
       <w:pPr>
@@ -1725,7 +1716,6 @@
         <w:rPr>
           <w:rFonts w:ascii="Garamond" w:hAnsi="Garamond" w:cs="Arial"/>
         </w:rPr>
-        <w:lastRenderedPageBreak/>
         <w:t>Ces graphiques seront essentiels pour approfondir votre compréhension des tendances de recherche dans votre domaine spécifique.</w:t>
       </w:r>
     </w:p>
@@ -2015,7 +2005,6 @@
               <w:bottom w:val="single" w:sz="4" w:space="0" w:color="auto"/>
               <w:right w:val="single" w:sz="4" w:space="0" w:color="auto"/>
             </w:tcBorders>
-            <w:shd w:val="clear" w:color="auto" w:fill="auto"/>
             <w:vAlign w:val="center"/>
             <w:hideMark/>
           </w:tcPr>
@@ -2071,7 +2060,6 @@
               <w:bottom w:val="single" w:sz="4" w:space="0" w:color="auto"/>
               <w:right w:val="single" w:sz="4" w:space="0" w:color="auto"/>
             </w:tcBorders>
-            <w:shd w:val="clear" w:color="auto" w:fill="auto"/>
             <w:vAlign w:val="center"/>
             <w:hideMark/>
           </w:tcPr>
@@ -2105,7 +2093,6 @@
               <w:bottom w:val="single" w:sz="4" w:space="0" w:color="auto"/>
               <w:right w:val="single" w:sz="4" w:space="0" w:color="auto"/>
             </w:tcBorders>
-            <w:shd w:val="clear" w:color="auto" w:fill="auto"/>
             <w:noWrap/>
             <w:vAlign w:val="center"/>
             <w:hideMark/>
@@ -2173,7 +2160,6 @@
               <w:bottom w:val="single" w:sz="4" w:space="0" w:color="auto"/>
               <w:right w:val="single" w:sz="4" w:space="0" w:color="auto"/>
             </w:tcBorders>
-            <w:shd w:val="clear" w:color="auto" w:fill="auto"/>
             <w:vAlign w:val="center"/>
             <w:hideMark/>
           </w:tcPr>
@@ -2266,7 +2252,6 @@
               <w:bottom w:val="nil"/>
               <w:right w:val="nil"/>
             </w:tcBorders>
-            <w:shd w:val="clear" w:color="auto" w:fill="auto"/>
             <w:noWrap/>
             <w:vAlign w:val="bottom"/>
             <w:hideMark/>
@@ -2299,7 +2284,6 @@
               <w:bottom w:val="single" w:sz="4" w:space="0" w:color="auto"/>
               <w:right w:val="single" w:sz="4" w:space="0" w:color="auto"/>
             </w:tcBorders>
-            <w:shd w:val="clear" w:color="auto" w:fill="auto"/>
             <w:vAlign w:val="center"/>
             <w:hideMark/>
           </w:tcPr>
@@ -2358,7 +2342,6 @@
               <w:bottom w:val="single" w:sz="4" w:space="0" w:color="auto"/>
               <w:right w:val="single" w:sz="4" w:space="0" w:color="auto"/>
             </w:tcBorders>
-            <w:shd w:val="clear" w:color="auto" w:fill="auto"/>
             <w:vAlign w:val="center"/>
             <w:hideMark/>
           </w:tcPr>
@@ -2470,7 +2453,6 @@
               <w:bottom w:val="nil"/>
               <w:right w:val="nil"/>
             </w:tcBorders>
-            <w:shd w:val="clear" w:color="auto" w:fill="auto"/>
             <w:noWrap/>
             <w:vAlign w:val="bottom"/>
             <w:hideMark/>
@@ -2503,7 +2485,6 @@
               <w:bottom w:val="single" w:sz="4" w:space="0" w:color="auto"/>
               <w:right w:val="single" w:sz="4" w:space="0" w:color="auto"/>
             </w:tcBorders>
-            <w:shd w:val="clear" w:color="auto" w:fill="auto"/>
             <w:vAlign w:val="center"/>
             <w:hideMark/>
           </w:tcPr>
@@ -2560,7 +2541,6 @@
               <w:bottom w:val="single" w:sz="4" w:space="0" w:color="auto"/>
               <w:right w:val="single" w:sz="4" w:space="0" w:color="auto"/>
             </w:tcBorders>
-            <w:shd w:val="clear" w:color="auto" w:fill="auto"/>
             <w:vAlign w:val="center"/>
             <w:hideMark/>
           </w:tcPr>
@@ -2672,7 +2652,6 @@
               <w:bottom w:val="nil"/>
               <w:right w:val="nil"/>
             </w:tcBorders>
-            <w:shd w:val="clear" w:color="auto" w:fill="auto"/>
             <w:noWrap/>
             <w:vAlign w:val="bottom"/>
             <w:hideMark/>
@@ -2705,7 +2684,6 @@
               <w:bottom w:val="single" w:sz="4" w:space="0" w:color="auto"/>
               <w:right w:val="single" w:sz="4" w:space="0" w:color="auto"/>
             </w:tcBorders>
-            <w:shd w:val="clear" w:color="auto" w:fill="auto"/>
             <w:vAlign w:val="center"/>
             <w:hideMark/>
           </w:tcPr>
@@ -2812,7 +2790,6 @@
               <w:bottom w:val="single" w:sz="4" w:space="0" w:color="auto"/>
               <w:right w:val="single" w:sz="4" w:space="0" w:color="auto"/>
             </w:tcBorders>
-            <w:shd w:val="clear" w:color="auto" w:fill="auto"/>
             <w:vAlign w:val="center"/>
             <w:hideMark/>
           </w:tcPr>
@@ -2924,7 +2901,6 @@
               <w:bottom w:val="nil"/>
               <w:right w:val="nil"/>
             </w:tcBorders>
-            <w:shd w:val="clear" w:color="auto" w:fill="auto"/>
             <w:noWrap/>
             <w:vAlign w:val="bottom"/>
             <w:hideMark/>
@@ -2956,7 +2932,6 @@
               <w:bottom w:val="single" w:sz="4" w:space="0" w:color="auto"/>
               <w:right w:val="single" w:sz="4" w:space="0" w:color="auto"/>
             </w:tcBorders>
-            <w:shd w:val="clear" w:color="auto" w:fill="auto"/>
             <w:vAlign w:val="center"/>
           </w:tcPr>
           <w:p>
@@ -3011,7 +2986,6 @@
               <w:bottom w:val="single" w:sz="4" w:space="0" w:color="auto"/>
               <w:right w:val="single" w:sz="4" w:space="0" w:color="auto"/>
             </w:tcBorders>
-            <w:shd w:val="clear" w:color="auto" w:fill="auto"/>
             <w:vAlign w:val="center"/>
           </w:tcPr>
           <w:p>
@@ -3059,7 +3033,6 @@
               <w:bottom w:val="single" w:sz="4" w:space="0" w:color="auto"/>
               <w:right w:val="single" w:sz="4" w:space="0" w:color="auto"/>
             </w:tcBorders>
-            <w:shd w:val="clear" w:color="auto" w:fill="auto"/>
             <w:vAlign w:val="center"/>
           </w:tcPr>
           <w:p>
@@ -3094,7 +3067,6 @@
               <w:bottom w:val="single" w:sz="4" w:space="0" w:color="auto"/>
               <w:right w:val="single" w:sz="4" w:space="0" w:color="auto"/>
             </w:tcBorders>
-            <w:shd w:val="clear" w:color="auto" w:fill="auto"/>
             <w:vAlign w:val="center"/>
           </w:tcPr>
           <w:p>
@@ -3143,7 +3115,6 @@
               <w:bottom w:val="single" w:sz="4" w:space="0" w:color="auto"/>
               <w:right w:val="single" w:sz="4" w:space="0" w:color="auto"/>
             </w:tcBorders>
-            <w:shd w:val="clear" w:color="auto" w:fill="auto"/>
             <w:vAlign w:val="center"/>
             <w:hideMark/>
           </w:tcPr>
@@ -3234,7 +3205,6 @@
               <w:bottom w:val="single" w:sz="4" w:space="0" w:color="auto"/>
               <w:right w:val="single" w:sz="4" w:space="0" w:color="auto"/>
             </w:tcBorders>
-            <w:shd w:val="clear" w:color="auto" w:fill="auto"/>
             <w:vAlign w:val="center"/>
             <w:hideMark/>
           </w:tcPr>
@@ -3344,7 +3314,6 @@
               <w:bottom w:val="nil"/>
               <w:right w:val="nil"/>
             </w:tcBorders>
-            <w:shd w:val="clear" w:color="auto" w:fill="auto"/>
             <w:noWrap/>
             <w:vAlign w:val="bottom"/>
             <w:hideMark/>
@@ -3426,7 +3395,6 @@
               <w:bottom w:val="single" w:sz="4" w:space="0" w:color="auto"/>
               <w:right w:val="single" w:sz="4" w:space="0" w:color="auto"/>
             </w:tcBorders>
-            <w:shd w:val="clear" w:color="auto" w:fill="auto"/>
             <w:vAlign w:val="center"/>
             <w:hideMark/>
           </w:tcPr>
@@ -3483,7 +3451,6 @@
               <w:bottom w:val="single" w:sz="4" w:space="0" w:color="auto"/>
               <w:right w:val="single" w:sz="4" w:space="0" w:color="auto"/>
             </w:tcBorders>
-            <w:shd w:val="clear" w:color="auto" w:fill="auto"/>
             <w:vAlign w:val="center"/>
             <w:hideMark/>
           </w:tcPr>
@@ -3517,7 +3484,6 @@
               <w:bottom w:val="single" w:sz="4" w:space="0" w:color="auto"/>
               <w:right w:val="single" w:sz="4" w:space="0" w:color="auto"/>
             </w:tcBorders>
-            <w:shd w:val="clear" w:color="auto" w:fill="auto"/>
             <w:noWrap/>
             <w:vAlign w:val="center"/>
             <w:hideMark/>
@@ -3576,7 +3542,6 @@
               <w:bottom w:val="single" w:sz="4" w:space="0" w:color="auto"/>
               <w:right w:val="single" w:sz="4" w:space="0" w:color="auto"/>
             </w:tcBorders>
-            <w:shd w:val="clear" w:color="auto" w:fill="auto"/>
             <w:vAlign w:val="center"/>
             <w:hideMark/>
           </w:tcPr>
@@ -3669,7 +3634,6 @@
               <w:bottom w:val="nil"/>
               <w:right w:val="nil"/>
             </w:tcBorders>
-            <w:shd w:val="clear" w:color="auto" w:fill="auto"/>
             <w:noWrap/>
             <w:vAlign w:val="bottom"/>
             <w:hideMark/>
@@ -3702,7 +3666,6 @@
               <w:bottom w:val="single" w:sz="4" w:space="0" w:color="auto"/>
               <w:right w:val="single" w:sz="4" w:space="0" w:color="auto"/>
             </w:tcBorders>
-            <w:shd w:val="clear" w:color="auto" w:fill="auto"/>
             <w:vAlign w:val="center"/>
             <w:hideMark/>
           </w:tcPr>
@@ -3761,7 +3724,6 @@
               <w:bottom w:val="single" w:sz="4" w:space="0" w:color="auto"/>
               <w:right w:val="single" w:sz="4" w:space="0" w:color="auto"/>
             </w:tcBorders>
-            <w:shd w:val="clear" w:color="auto" w:fill="auto"/>
             <w:vAlign w:val="center"/>
             <w:hideMark/>
           </w:tcPr>
@@ -3873,7 +3835,6 @@
               <w:bottom w:val="nil"/>
               <w:right w:val="nil"/>
             </w:tcBorders>
-            <w:shd w:val="clear" w:color="auto" w:fill="auto"/>
             <w:noWrap/>
             <w:vAlign w:val="bottom"/>
             <w:hideMark/>
@@ -3906,7 +3867,6 @@
               <w:bottom w:val="single" w:sz="4" w:space="0" w:color="auto"/>
               <w:right w:val="single" w:sz="4" w:space="0" w:color="auto"/>
             </w:tcBorders>
-            <w:shd w:val="clear" w:color="auto" w:fill="auto"/>
             <w:vAlign w:val="center"/>
             <w:hideMark/>
           </w:tcPr>
@@ -3963,7 +3923,6 @@
               <w:bottom w:val="single" w:sz="4" w:space="0" w:color="auto"/>
               <w:right w:val="single" w:sz="4" w:space="0" w:color="auto"/>
             </w:tcBorders>
-            <w:shd w:val="clear" w:color="auto" w:fill="auto"/>
             <w:vAlign w:val="center"/>
             <w:hideMark/>
           </w:tcPr>
@@ -4075,7 +4034,6 @@
               <w:bottom w:val="nil"/>
               <w:right w:val="nil"/>
             </w:tcBorders>
-            <w:shd w:val="clear" w:color="auto" w:fill="auto"/>
             <w:noWrap/>
             <w:vAlign w:val="bottom"/>
             <w:hideMark/>
@@ -4108,7 +4066,6 @@
               <w:bottom w:val="single" w:sz="4" w:space="0" w:color="auto"/>
               <w:right w:val="single" w:sz="4" w:space="0" w:color="auto"/>
             </w:tcBorders>
-            <w:shd w:val="clear" w:color="auto" w:fill="auto"/>
             <w:vAlign w:val="center"/>
             <w:hideMark/>
           </w:tcPr>
@@ -4215,7 +4172,6 @@
               <w:bottom w:val="single" w:sz="4" w:space="0" w:color="auto"/>
               <w:right w:val="single" w:sz="4" w:space="0" w:color="auto"/>
             </w:tcBorders>
-            <w:shd w:val="clear" w:color="auto" w:fill="auto"/>
             <w:vAlign w:val="center"/>
             <w:hideMark/>
           </w:tcPr>
@@ -4327,7 +4283,6 @@
               <w:bottom w:val="nil"/>
               <w:right w:val="nil"/>
             </w:tcBorders>
-            <w:shd w:val="clear" w:color="auto" w:fill="auto"/>
             <w:noWrap/>
             <w:vAlign w:val="bottom"/>
             <w:hideMark/>
@@ -4359,7 +4314,6 @@
               <w:bottom w:val="single" w:sz="4" w:space="0" w:color="auto"/>
               <w:right w:val="single" w:sz="4" w:space="0" w:color="auto"/>
             </w:tcBorders>
-            <w:shd w:val="clear" w:color="auto" w:fill="auto"/>
             <w:vAlign w:val="center"/>
           </w:tcPr>
           <w:p>
@@ -4414,7 +4368,6 @@
               <w:bottom w:val="single" w:sz="4" w:space="0" w:color="auto"/>
               <w:right w:val="single" w:sz="4" w:space="0" w:color="auto"/>
             </w:tcBorders>
-            <w:shd w:val="clear" w:color="auto" w:fill="auto"/>
             <w:vAlign w:val="center"/>
           </w:tcPr>
           <w:p>
@@ -4462,7 +4415,6 @@
               <w:bottom w:val="single" w:sz="4" w:space="0" w:color="auto"/>
               <w:right w:val="single" w:sz="4" w:space="0" w:color="auto"/>
             </w:tcBorders>
-            <w:shd w:val="clear" w:color="auto" w:fill="auto"/>
             <w:vAlign w:val="center"/>
           </w:tcPr>
           <w:p>
@@ -4497,7 +4449,6 @@
               <w:bottom w:val="single" w:sz="4" w:space="0" w:color="auto"/>
               <w:right w:val="single" w:sz="4" w:space="0" w:color="auto"/>
             </w:tcBorders>
-            <w:shd w:val="clear" w:color="auto" w:fill="auto"/>
             <w:vAlign w:val="center"/>
           </w:tcPr>
           <w:p>
@@ -4546,7 +4497,6 @@
               <w:bottom w:val="single" w:sz="4" w:space="0" w:color="auto"/>
               <w:right w:val="single" w:sz="4" w:space="0" w:color="auto"/>
             </w:tcBorders>
-            <w:shd w:val="clear" w:color="auto" w:fill="auto"/>
             <w:vAlign w:val="center"/>
             <w:hideMark/>
           </w:tcPr>
@@ -4637,7 +4587,6 @@
               <w:bottom w:val="single" w:sz="4" w:space="0" w:color="auto"/>
               <w:right w:val="single" w:sz="4" w:space="0" w:color="auto"/>
             </w:tcBorders>
-            <w:shd w:val="clear" w:color="auto" w:fill="auto"/>
             <w:vAlign w:val="center"/>
             <w:hideMark/>
           </w:tcPr>
@@ -4747,7 +4696,6 @@
               <w:bottom w:val="nil"/>
               <w:right w:val="nil"/>
             </w:tcBorders>
-            <w:shd w:val="clear" w:color="auto" w:fill="auto"/>
             <w:noWrap/>
             <w:vAlign w:val="bottom"/>
             <w:hideMark/>
@@ -4829,7 +4777,6 @@
               <w:bottom w:val="single" w:sz="4" w:space="0" w:color="auto"/>
               <w:right w:val="single" w:sz="4" w:space="0" w:color="auto"/>
             </w:tcBorders>
-            <w:shd w:val="clear" w:color="auto" w:fill="auto"/>
             <w:vAlign w:val="center"/>
             <w:hideMark/>
           </w:tcPr>
@@ -4886,7 +4833,6 @@
               <w:bottom w:val="single" w:sz="4" w:space="0" w:color="auto"/>
               <w:right w:val="single" w:sz="4" w:space="0" w:color="auto"/>
             </w:tcBorders>
-            <w:shd w:val="clear" w:color="auto" w:fill="auto"/>
             <w:vAlign w:val="center"/>
             <w:hideMark/>
           </w:tcPr>
@@ -4920,7 +4866,6 @@
               <w:bottom w:val="single" w:sz="4" w:space="0" w:color="auto"/>
               <w:right w:val="single" w:sz="4" w:space="0" w:color="auto"/>
             </w:tcBorders>
-            <w:shd w:val="clear" w:color="auto" w:fill="auto"/>
             <w:noWrap/>
             <w:vAlign w:val="center"/>
             <w:hideMark/>
@@ -4979,7 +4924,6 @@
               <w:bottom w:val="single" w:sz="4" w:space="0" w:color="auto"/>
               <w:right w:val="single" w:sz="4" w:space="0" w:color="auto"/>
             </w:tcBorders>
-            <w:shd w:val="clear" w:color="auto" w:fill="auto"/>
             <w:vAlign w:val="center"/>
             <w:hideMark/>
           </w:tcPr>
@@ -5072,7 +5016,6 @@
               <w:bottom w:val="nil"/>
               <w:right w:val="nil"/>
             </w:tcBorders>
-            <w:shd w:val="clear" w:color="auto" w:fill="auto"/>
             <w:noWrap/>
             <w:vAlign w:val="bottom"/>
             <w:hideMark/>
@@ -5105,7 +5048,6 @@
               <w:bottom w:val="single" w:sz="4" w:space="0" w:color="auto"/>
               <w:right w:val="single" w:sz="4" w:space="0" w:color="auto"/>
             </w:tcBorders>
-            <w:shd w:val="clear" w:color="auto" w:fill="auto"/>
             <w:vAlign w:val="center"/>
             <w:hideMark/>
           </w:tcPr>
@@ -5164,7 +5106,6 @@
               <w:bottom w:val="single" w:sz="4" w:space="0" w:color="auto"/>
               <w:right w:val="single" w:sz="4" w:space="0" w:color="auto"/>
             </w:tcBorders>
-            <w:shd w:val="clear" w:color="auto" w:fill="auto"/>
             <w:vAlign w:val="center"/>
             <w:hideMark/>
           </w:tcPr>
@@ -5276,7 +5217,6 @@
               <w:bottom w:val="nil"/>
               <w:right w:val="nil"/>
             </w:tcBorders>
-            <w:shd w:val="clear" w:color="auto" w:fill="auto"/>
             <w:noWrap/>
             <w:vAlign w:val="bottom"/>
             <w:hideMark/>
@@ -5309,7 +5249,6 @@
               <w:bottom w:val="single" w:sz="4" w:space="0" w:color="auto"/>
               <w:right w:val="single" w:sz="4" w:space="0" w:color="auto"/>
             </w:tcBorders>
-            <w:shd w:val="clear" w:color="auto" w:fill="auto"/>
             <w:vAlign w:val="center"/>
             <w:hideMark/>
           </w:tcPr>
@@ -5366,7 +5305,6 @@
               <w:bottom w:val="single" w:sz="4" w:space="0" w:color="auto"/>
               <w:right w:val="single" w:sz="4" w:space="0" w:color="auto"/>
             </w:tcBorders>
-            <w:shd w:val="clear" w:color="auto" w:fill="auto"/>
             <w:vAlign w:val="center"/>
             <w:hideMark/>
           </w:tcPr>
@@ -5478,7 +5416,6 @@
               <w:bottom w:val="nil"/>
               <w:right w:val="nil"/>
             </w:tcBorders>
-            <w:shd w:val="clear" w:color="auto" w:fill="auto"/>
             <w:noWrap/>
             <w:vAlign w:val="bottom"/>
             <w:hideMark/>
@@ -5511,7 +5448,6 @@
               <w:bottom w:val="single" w:sz="4" w:space="0" w:color="auto"/>
               <w:right w:val="single" w:sz="4" w:space="0" w:color="auto"/>
             </w:tcBorders>
-            <w:shd w:val="clear" w:color="auto" w:fill="auto"/>
             <w:vAlign w:val="center"/>
             <w:hideMark/>
           </w:tcPr>
@@ -5618,7 +5554,6 @@
               <w:bottom w:val="single" w:sz="4" w:space="0" w:color="auto"/>
               <w:right w:val="single" w:sz="4" w:space="0" w:color="auto"/>
             </w:tcBorders>
-            <w:shd w:val="clear" w:color="auto" w:fill="auto"/>
             <w:vAlign w:val="center"/>
             <w:hideMark/>
           </w:tcPr>
@@ -5730,7 +5665,6 @@
               <w:bottom w:val="nil"/>
               <w:right w:val="nil"/>
             </w:tcBorders>
-            <w:shd w:val="clear" w:color="auto" w:fill="auto"/>
             <w:noWrap/>
             <w:vAlign w:val="bottom"/>
             <w:hideMark/>
@@ -5762,7 +5696,6 @@
               <w:bottom w:val="single" w:sz="4" w:space="0" w:color="auto"/>
               <w:right w:val="single" w:sz="4" w:space="0" w:color="auto"/>
             </w:tcBorders>
-            <w:shd w:val="clear" w:color="auto" w:fill="auto"/>
             <w:vAlign w:val="center"/>
           </w:tcPr>
           <w:p>
@@ -5817,7 +5750,6 @@
               <w:bottom w:val="single" w:sz="4" w:space="0" w:color="auto"/>
               <w:right w:val="single" w:sz="4" w:space="0" w:color="auto"/>
             </w:tcBorders>
-            <w:shd w:val="clear" w:color="auto" w:fill="auto"/>
             <w:vAlign w:val="center"/>
           </w:tcPr>
           <w:p>
@@ -5865,7 +5797,6 @@
               <w:bottom w:val="single" w:sz="4" w:space="0" w:color="auto"/>
               <w:right w:val="single" w:sz="4" w:space="0" w:color="auto"/>
             </w:tcBorders>
-            <w:shd w:val="clear" w:color="auto" w:fill="auto"/>
             <w:vAlign w:val="center"/>
           </w:tcPr>
           <w:p>
@@ -5900,7 +5831,6 @@
               <w:bottom w:val="single" w:sz="4" w:space="0" w:color="auto"/>
               <w:right w:val="single" w:sz="4" w:space="0" w:color="auto"/>
             </w:tcBorders>
-            <w:shd w:val="clear" w:color="auto" w:fill="auto"/>
             <w:vAlign w:val="center"/>
           </w:tcPr>
           <w:p>
@@ -5949,7 +5879,6 @@
               <w:bottom w:val="single" w:sz="4" w:space="0" w:color="auto"/>
               <w:right w:val="single" w:sz="4" w:space="0" w:color="auto"/>
             </w:tcBorders>
-            <w:shd w:val="clear" w:color="auto" w:fill="auto"/>
             <w:vAlign w:val="center"/>
             <w:hideMark/>
           </w:tcPr>
@@ -6040,7 +5969,6 @@
               <w:bottom w:val="single" w:sz="4" w:space="0" w:color="auto"/>
               <w:right w:val="single" w:sz="4" w:space="0" w:color="auto"/>
             </w:tcBorders>
-            <w:shd w:val="clear" w:color="auto" w:fill="auto"/>
             <w:vAlign w:val="center"/>
             <w:hideMark/>
           </w:tcPr>
@@ -6150,7 +6078,6 @@
               <w:bottom w:val="nil"/>
               <w:right w:val="nil"/>
             </w:tcBorders>
-            <w:shd w:val="clear" w:color="auto" w:fill="auto"/>
             <w:noWrap/>
             <w:vAlign w:val="bottom"/>
             <w:hideMark/>
@@ -6317,7 +6244,6 @@
               <w:bottom w:val="single" w:sz="4" w:space="0" w:color="auto"/>
               <w:right w:val="single" w:sz="4" w:space="0" w:color="auto"/>
             </w:tcBorders>
-            <w:shd w:val="clear" w:color="auto" w:fill="auto"/>
             <w:vAlign w:val="center"/>
             <w:hideMark/>
           </w:tcPr>
@@ -6364,7 +6290,6 @@
               <w:bottom w:val="single" w:sz="4" w:space="0" w:color="auto"/>
               <w:right w:val="single" w:sz="4" w:space="0" w:color="auto"/>
             </w:tcBorders>
-            <w:shd w:val="clear" w:color="auto" w:fill="auto"/>
             <w:noWrap/>
             <w:vAlign w:val="center"/>
             <w:hideMark/>
@@ -6427,7 +6352,6 @@
               <w:bottom w:val="single" w:sz="4" w:space="0" w:color="auto"/>
               <w:right w:val="single" w:sz="4" w:space="0" w:color="auto"/>
             </w:tcBorders>
-            <w:shd w:val="clear" w:color="auto" w:fill="auto"/>
             <w:vAlign w:val="center"/>
             <w:hideMark/>
           </w:tcPr>
@@ -6462,7 +6386,6 @@
               <w:bottom w:val="single" w:sz="4" w:space="0" w:color="auto"/>
               <w:right w:val="single" w:sz="4" w:space="0" w:color="auto"/>
             </w:tcBorders>
-            <w:shd w:val="clear" w:color="auto" w:fill="auto"/>
             <w:noWrap/>
             <w:vAlign w:val="bottom"/>
             <w:hideMark/>
@@ -6499,7 +6422,6 @@
               <w:bottom w:val="single" w:sz="4" w:space="0" w:color="auto"/>
               <w:right w:val="single" w:sz="4" w:space="0" w:color="auto"/>
             </w:tcBorders>
-            <w:shd w:val="clear" w:color="auto" w:fill="auto"/>
             <w:vAlign w:val="center"/>
             <w:hideMark/>
           </w:tcPr>
@@ -6534,7 +6456,6 @@
               <w:bottom w:val="single" w:sz="4" w:space="0" w:color="auto"/>
               <w:right w:val="single" w:sz="4" w:space="0" w:color="auto"/>
             </w:tcBorders>
-            <w:shd w:val="clear" w:color="auto" w:fill="auto"/>
             <w:noWrap/>
             <w:vAlign w:val="bottom"/>
             <w:hideMark/>
@@ -6571,7 +6492,6 @@
               <w:bottom w:val="single" w:sz="4" w:space="0" w:color="auto"/>
               <w:right w:val="single" w:sz="4" w:space="0" w:color="auto"/>
             </w:tcBorders>
-            <w:shd w:val="clear" w:color="auto" w:fill="auto"/>
             <w:vAlign w:val="center"/>
             <w:hideMark/>
           </w:tcPr>
@@ -6606,7 +6526,6 @@
               <w:bottom w:val="single" w:sz="4" w:space="0" w:color="auto"/>
               <w:right w:val="single" w:sz="4" w:space="0" w:color="auto"/>
             </w:tcBorders>
-            <w:shd w:val="clear" w:color="auto" w:fill="auto"/>
             <w:noWrap/>
             <w:vAlign w:val="bottom"/>
             <w:hideMark/>
@@ -6643,7 +6562,6 @@
               <w:bottom w:val="single" w:sz="4" w:space="0" w:color="auto"/>
               <w:right w:val="single" w:sz="4" w:space="0" w:color="auto"/>
             </w:tcBorders>
-            <w:shd w:val="clear" w:color="auto" w:fill="auto"/>
             <w:vAlign w:val="center"/>
             <w:hideMark/>
           </w:tcPr>
@@ -6678,7 +6596,6 @@
               <w:bottom w:val="single" w:sz="4" w:space="0" w:color="auto"/>
               <w:right w:val="single" w:sz="4" w:space="0" w:color="auto"/>
             </w:tcBorders>
-            <w:shd w:val="clear" w:color="auto" w:fill="auto"/>
             <w:noWrap/>
             <w:vAlign w:val="bottom"/>
             <w:hideMark/>
@@ -6707,7 +6624,6 @@
               <w:bottom w:val="single" w:sz="4" w:space="0" w:color="auto"/>
               <w:right w:val="single" w:sz="4" w:space="0" w:color="auto"/>
             </w:tcBorders>
-            <w:shd w:val="clear" w:color="auto" w:fill="auto"/>
             <w:vAlign w:val="center"/>
             <w:hideMark/>
           </w:tcPr>
@@ -6742,7 +6658,6 @@
               <w:bottom w:val="single" w:sz="4" w:space="0" w:color="auto"/>
               <w:right w:val="single" w:sz="4" w:space="0" w:color="auto"/>
             </w:tcBorders>
-            <w:shd w:val="clear" w:color="auto" w:fill="auto"/>
             <w:noWrap/>
             <w:vAlign w:val="bottom"/>
             <w:hideMark/>
@@ -6779,7 +6694,6 @@
               <w:bottom w:val="single" w:sz="4" w:space="0" w:color="auto"/>
               <w:right w:val="single" w:sz="4" w:space="0" w:color="auto"/>
             </w:tcBorders>
-            <w:shd w:val="clear" w:color="auto" w:fill="auto"/>
             <w:vAlign w:val="center"/>
             <w:hideMark/>
           </w:tcPr>
@@ -6801,29 +6715,7 @@
                 <w:color w:val="000000"/>
                 <w:lang w:val="en-US" w:eastAsia="fr-FR"/>
               </w:rPr>
-              <w:t xml:space="preserve">How </w:t>
-            </w:r>
-            <w:proofErr w:type="gramStart"/>
-            <w:r>
-              <w:rPr>
-                <w:rFonts w:ascii="Arial Narrow" w:eastAsia="Times New Roman" w:hAnsi="Arial Narrow" w:cs="Arial"/>
-                <w:b/>
-                <w:bCs/>
-                <w:color w:val="000000"/>
-                <w:lang w:val="en-US" w:eastAsia="fr-FR"/>
-              </w:rPr>
-              <w:t>this results</w:t>
-            </w:r>
-            <w:proofErr w:type="gramEnd"/>
-            <w:r>
-              <w:rPr>
-                <w:rFonts w:ascii="Arial Narrow" w:eastAsia="Times New Roman" w:hAnsi="Arial Narrow" w:cs="Arial"/>
-                <w:b/>
-                <w:bCs/>
-                <w:color w:val="000000"/>
-                <w:lang w:val="en-US" w:eastAsia="fr-FR"/>
-              </w:rPr>
-              <w:t xml:space="preserve"> matter for my subject?</w:t>
+              <w:t>How this results matter for my subject?</w:t>
             </w:r>
           </w:p>
         </w:tc>
@@ -6836,7 +6728,6 @@
               <w:bottom w:val="single" w:sz="4" w:space="0" w:color="auto"/>
               <w:right w:val="single" w:sz="4" w:space="0" w:color="auto"/>
             </w:tcBorders>
-            <w:shd w:val="clear" w:color="auto" w:fill="auto"/>
             <w:noWrap/>
             <w:vAlign w:val="bottom"/>
             <w:hideMark/>
@@ -6873,7 +6764,6 @@
               <w:bottom w:val="single" w:sz="4" w:space="0" w:color="auto"/>
               <w:right w:val="single" w:sz="4" w:space="0" w:color="auto"/>
             </w:tcBorders>
-            <w:shd w:val="clear" w:color="auto" w:fill="auto"/>
             <w:vAlign w:val="center"/>
             <w:hideMark/>
           </w:tcPr>
@@ -6908,7 +6798,6 @@
               <w:bottom w:val="single" w:sz="4" w:space="0" w:color="auto"/>
               <w:right w:val="single" w:sz="4" w:space="0" w:color="auto"/>
             </w:tcBorders>
-            <w:shd w:val="clear" w:color="auto" w:fill="auto"/>
             <w:noWrap/>
             <w:vAlign w:val="bottom"/>
             <w:hideMark/>
@@ -6933,6 +6822,39 @@
         </w:tc>
       </w:tr>
     </w:tbl>
+    <w:p>
+      <w:pPr>
+        <w:rPr>
+          <w:rFonts w:ascii="Arial Narrow" w:eastAsia="Times New Roman" w:hAnsi="Arial Narrow" w:cs="Arial"/>
+          <w:b/>
+          <w:bCs/>
+          <w:color w:val="000000"/>
+          <w:lang w:val="en-US" w:eastAsia="fr-FR"/>
+        </w:rPr>
+      </w:pPr>
+    </w:p>
+    <w:p>
+      <w:pPr>
+        <w:rPr>
+          <w:rFonts w:ascii="Arial Narrow" w:eastAsia="Times New Roman" w:hAnsi="Arial Narrow" w:cs="Arial"/>
+          <w:b/>
+          <w:bCs/>
+          <w:color w:val="000000"/>
+          <w:lang w:val="en-US" w:eastAsia="fr-FR"/>
+        </w:rPr>
+      </w:pPr>
+    </w:p>
+    <w:p>
+      <w:pPr>
+        <w:rPr>
+          <w:rFonts w:ascii="Arial Narrow" w:eastAsia="Times New Roman" w:hAnsi="Arial Narrow" w:cs="Arial"/>
+          <w:b/>
+          <w:bCs/>
+          <w:color w:val="000000"/>
+          <w:lang w:val="en-US" w:eastAsia="fr-FR"/>
+        </w:rPr>
+      </w:pPr>
+    </w:p>
     <w:p>
       <w:pPr>
         <w:rPr>
@@ -6949,6 +6871,548 @@
           <w:titlePg/>
           <w:docGrid w:linePitch="360"/>
         </w:sectPr>
+      </w:pPr>
+      <w:proofErr w:type="spellStart"/>
+      <w:r>
+        <w:rPr>
+          <w:rFonts w:ascii="Arial Narrow" w:eastAsia="Times New Roman" w:hAnsi="Arial Narrow" w:cs="Arial"/>
+          <w:b/>
+          <w:bCs/>
+          <w:color w:val="000000"/>
+          <w:lang w:val="en-US" w:eastAsia="fr-FR"/>
+        </w:rPr>
+        <w:t>ce</w:t>
+      </w:r>
+      <w:proofErr w:type="spellEnd"/>
+    </w:p>
+    <w:p>
+      <w:pPr>
+        <w:rPr>
+          <w:rFonts w:ascii="Roboto Condensed" w:hAnsi="Roboto Condensed"/>
+          <w:lang w:val="en-US"/>
+        </w:rPr>
+      </w:pPr>
+      <w:r>
+        <w:rPr>
+          <w:rFonts w:ascii="Roboto Condensed" w:hAnsi="Roboto Condensed"/>
+          <w:lang w:val="en-US"/>
+        </w:rPr>
+        <w:lastRenderedPageBreak/>
+        <w:fldChar w:fldCharType="begin"/>
+      </w:r>
+      <w:r>
+        <w:rPr>
+          <w:rFonts w:ascii="Roboto Condensed" w:hAnsi="Roboto Condensed"/>
+          <w:lang w:val="en-US"/>
+        </w:rPr>
+        <w:instrText xml:space="preserve"> ADDIN ZOTERO_ITEM CSL_CITATION {"citationID":"RF5rLLhG","properties":{"unsorted":false,"formattedCitation":"[1]","plainCitation":"[1]","noteIndex":0},"citationItems":[{"id":2534,"uris":["http://zotero.org/users/7640139/items/BCW95DL8"],"itemData":{"id":2534,"type":"article-journal","abstract":"Numerous sets of usability heuristics have been designed for specific domains, as traditional heuristics do not evaluate the specific features of particular applications. A substantial portion of the existing research focuses on designing new sets of heuristics, demonstrating the interest in heuristics that might identify specific usability problems for specific application domains. This article presents an exhaustive review of 73 studies related to usability heuristics for specific domains and methodologies; the objective is to identify the approach that is used to create usability heuristics and whether a formal and systematic process is involved. We conducted a systematic literature review of papers published between 2006 and 2016. The review was based on the guidelines proposed by Kitchenham (2007) [13] and shows that most studies use an informal process to develop usability heuristics. The creation of heuristics is mainly based on existing heuristics, literature reviews, usability problems, and guidelines. However, a few studies apply a methodology to define, validate and refine the set of heuristics proposed. Nevertheless, these methodologies should be formalized in order to help the process of creating usability heuristics.","container-title":"Computer Standards &amp; Interfaces","DOI":"10.1016/j.csi.2017.03.009","ISSN":"09205489","issue":"March","note":"publisher: Elsevier\nCitation Key: Quinones2017","page":"89-122","title":"How to develop usability heuristics: A systematic literature review","volume":"53","author":[{"family":"Quiñones","given":"Daniela"},{"family":"Rusu","given":"Cristian"}],"issued":{"date-parts":[["2017"]]},"citation-key":"Quinones2017"}}],"schema":"https://github.com/citation-style-language/schema/raw/master/csl-citation.json"} </w:instrText>
+      </w:r>
+      <w:r>
+        <w:rPr>
+          <w:rFonts w:ascii="Roboto Condensed" w:hAnsi="Roboto Condensed"/>
+          <w:lang w:val="en-US"/>
+        </w:rPr>
+        <w:fldChar w:fldCharType="separate"/>
+      </w:r>
+      <w:r>
+        <w:rPr>
+          <w:rFonts w:ascii="Roboto Condensed" w:hAnsi="Roboto Condensed" w:cs="Times New Roman"/>
+          <w:szCs w:val="24"/>
+        </w:rPr>
+        <w:t>[1]</w:t>
+      </w:r>
+      <w:r>
+        <w:rPr>
+          <w:rFonts w:ascii="Roboto Condensed" w:hAnsi="Roboto Condensed"/>
+          <w:lang w:val="en-US"/>
+        </w:rPr>
+        <w:fldChar w:fldCharType="end"/>
+      </w:r>
+    </w:p>
+    <w:p>
+      <w:pPr>
+        <w:rPr>
+          <w:rFonts w:ascii="Roboto Condensed" w:hAnsi="Roboto Condensed"/>
+          <w:lang w:val="en-US"/>
+        </w:rPr>
+      </w:pPr>
+      <w:r>
+        <w:rPr>
+          <w:rFonts w:ascii="Roboto Condensed" w:hAnsi="Roboto Condensed"/>
+          <w:lang w:val="en-US"/>
+        </w:rPr>
+        <w:fldChar w:fldCharType="begin"/>
+      </w:r>
+      <w:r>
+        <w:rPr>
+          <w:rFonts w:ascii="Roboto Condensed" w:hAnsi="Roboto Condensed"/>
+          <w:lang w:val="en-US"/>
+        </w:rPr>
+        <w:instrText xml:space="preserve"> ADDIN ZOTERO_ITEM CSL_CITATION {"citationID":"Z84MMg1v","properties":{"unsorted":false,"formattedCitation":"[2]","plainCitation":"[2]","noteIndex":0},"citationItems":[{"id":4514,"uris":["http://zotero.org/users/7640139/items/2ACTWWC6"],"itemData":{"id":4514,"type":"article-journal","abstract":"Companies, universities and municipalities have all bet on the development of fab labs. They want to promote the development of innovation projects through these spaces dedicated to learning and collaboration. This article presents the different facets of fab labs through a systematic questioning. After a quick introduction, an analysis of the typologies and resources available in fab labs is given. Their networking and modes of governance are discussed, then the article highlights the actors of these spaces and the projects that are realized within them. Finally, some perspectives on the future of these spaces are proposed.","container-title":"Management et ingénierie de l'innovation","DOI":"10.51257/a-v1-ag276","language":"fr","license":"All rights reserved","source":"DOI.org (Crossref)","title":"Les fab labs : des lieux de partage pour booster l’innovation","title-short":"Les fab labs","URL":"https://www.techniques-ingenieur.fr/doi/10.51257/a/v1/ag276","author":[{"family":"Cruz","given":"Fabio"},{"family":"Hassan","given":"Alaa"},{"family":"Boudaoud","given":"Hakim"}],"accessed":{"date-parts":[["2023",11,23]]},"issued":{"date-parts":[["2023",3]]},"citation-key":"cruz2023"}}],"schema":"https://github.com/citation-style-language/schema/raw/master/csl-citation.json"} </w:instrText>
+      </w:r>
+      <w:r>
+        <w:rPr>
+          <w:rFonts w:ascii="Roboto Condensed" w:hAnsi="Roboto Condensed"/>
+          <w:lang w:val="en-US"/>
+        </w:rPr>
+        <w:fldChar w:fldCharType="separate"/>
+      </w:r>
+      <w:r>
+        <w:rPr>
+          <w:rFonts w:ascii="Roboto Condensed" w:hAnsi="Roboto Condensed"/>
+          <w:noProof/>
+          <w:lang w:val="en-US"/>
+        </w:rPr>
+        <w:t>[2]</w:t>
+      </w:r>
+      <w:r>
+        <w:rPr>
+          <w:rFonts w:ascii="Roboto Condensed" w:hAnsi="Roboto Condensed"/>
+          <w:lang w:val="en-US"/>
+        </w:rPr>
+        <w:fldChar w:fldCharType="end"/>
+      </w:r>
+    </w:p>
+    <w:p>
+      <w:pPr>
+        <w:rPr>
+          <w:rFonts w:ascii="Roboto Condensed" w:hAnsi="Roboto Condensed"/>
+          <w:lang w:val="en-US"/>
+        </w:rPr>
+      </w:pPr>
+    </w:p>
+    <w:p>
+      <w:pPr>
+        <w:rPr>
+          <w:rFonts w:ascii="Roboto Condensed" w:hAnsi="Roboto Condensed"/>
+          <w:lang w:val="en-US"/>
+        </w:rPr>
+      </w:pPr>
+    </w:p>
+    <w:p>
+      <w:pPr>
+        <w:rPr>
+          <w:rFonts w:ascii="Roboto Condensed" w:hAnsi="Roboto Condensed"/>
+          <w:lang w:val="en-US"/>
+        </w:rPr>
+      </w:pPr>
+    </w:p>
+    <w:p>
+      <w:pPr>
+        <w:rPr>
+          <w:rFonts w:ascii="Roboto Condensed" w:hAnsi="Roboto Condensed"/>
+          <w:lang w:val="en-US"/>
+        </w:rPr>
+      </w:pPr>
+      <w:proofErr w:type="spellStart"/>
+      <w:r>
+        <w:rPr>
+          <w:rFonts w:ascii="Roboto Condensed" w:hAnsi="Roboto Condensed"/>
+          <w:lang w:val="en-US"/>
+        </w:rPr>
+        <w:t>Cecic</w:t>
+      </w:r>
+      <w:proofErr w:type="spellEnd"/>
+      <w:r>
+        <w:rPr>
+          <w:rFonts w:ascii="Roboto Condensed" w:hAnsi="Roboto Condensed"/>
+          <w:lang w:val="en-US"/>
+        </w:rPr>
+        <w:t xml:space="preserve"> est </w:t>
+      </w:r>
+      <w:proofErr w:type="spellStart"/>
+      <w:r>
+        <w:rPr>
+          <w:rFonts w:ascii="Roboto Condensed" w:hAnsi="Roboto Condensed"/>
+          <w:lang w:val="en-US"/>
+        </w:rPr>
+        <w:t>une</w:t>
+      </w:r>
+      <w:proofErr w:type="spellEnd"/>
+      <w:r>
+        <w:rPr>
+          <w:rFonts w:ascii="Roboto Condensed" w:hAnsi="Roboto Condensed"/>
+          <w:lang w:val="en-US"/>
+        </w:rPr>
+        <w:t xml:space="preserve"> references</w:t>
+      </w:r>
+    </w:p>
+    <w:p>
+      <w:pPr>
+        <w:rPr>
+          <w:rFonts w:ascii="Roboto Condensed" w:hAnsi="Roboto Condensed"/>
+          <w:lang w:val="en-US"/>
+        </w:rPr>
+      </w:pPr>
+    </w:p>
+    <w:p>
+      <w:pPr>
+        <w:rPr>
+          <w:rFonts w:ascii="Roboto Condensed" w:hAnsi="Roboto Condensed"/>
+          <w:b/>
+          <w:bCs/>
+          <w:lang w:val="en-US"/>
+        </w:rPr>
+      </w:pPr>
+      <w:proofErr w:type="spellStart"/>
+      <w:r>
+        <w:rPr>
+          <w:rFonts w:ascii="Roboto Condensed" w:hAnsi="Roboto Condensed"/>
+          <w:b/>
+          <w:bCs/>
+          <w:lang w:val="en-US"/>
+        </w:rPr>
+        <w:t>Bibliographie</w:t>
+      </w:r>
+      <w:proofErr w:type="spellEnd"/>
+    </w:p>
+    <w:p>
+      <w:pPr>
+        <w:pStyle w:val="Bibliographie"/>
+        <w:rPr>
+          <w:rFonts w:ascii="Roboto Condensed" w:hAnsi="Roboto Condensed"/>
+        </w:rPr>
+      </w:pPr>
+      <w:r>
+        <w:rPr>
+          <w:rFonts w:ascii="Roboto Condensed" w:hAnsi="Roboto Condensed"/>
+          <w:lang w:val="en-US"/>
+        </w:rPr>
+        <w:fldChar w:fldCharType="begin"/>
+      </w:r>
+      <w:r>
+        <w:rPr>
+          <w:rFonts w:ascii="Roboto Condensed" w:hAnsi="Roboto Condensed"/>
+          <w:lang w:val="en-US"/>
+        </w:rPr>
+        <w:instrText xml:space="preserve"> ADDIN ZOTERO_BIBL {"uncited":[],"omitted":[],"custom":[]} CSL_BIBLIOGRAPHY </w:instrText>
+      </w:r>
+      <w:r>
+        <w:rPr>
+          <w:rFonts w:ascii="Roboto Condensed" w:hAnsi="Roboto Condensed"/>
+          <w:lang w:val="en-US"/>
+        </w:rPr>
+        <w:fldChar w:fldCharType="separate"/>
+      </w:r>
+      <w:r>
+        <w:rPr>
+          <w:rFonts w:ascii="Roboto Condensed" w:hAnsi="Roboto Condensed"/>
+        </w:rPr>
+        <w:t>[1]</w:t>
+      </w:r>
+      <w:r>
+        <w:rPr>
+          <w:rFonts w:ascii="Roboto Condensed" w:hAnsi="Roboto Condensed"/>
+        </w:rPr>
+        <w:tab/>
+        <w:t xml:space="preserve">D. </w:t>
+      </w:r>
+      <w:proofErr w:type="spellStart"/>
+      <w:r>
+        <w:rPr>
+          <w:rFonts w:ascii="Roboto Condensed" w:hAnsi="Roboto Condensed"/>
+        </w:rPr>
+        <w:t>Quiñones</w:t>
+      </w:r>
+      <w:proofErr w:type="spellEnd"/>
+      <w:r>
+        <w:rPr>
+          <w:rFonts w:ascii="Roboto Condensed" w:hAnsi="Roboto Condensed"/>
+        </w:rPr>
+        <w:t xml:space="preserve"> et C. </w:t>
+      </w:r>
+      <w:proofErr w:type="spellStart"/>
+      <w:r>
+        <w:rPr>
+          <w:rFonts w:ascii="Roboto Condensed" w:hAnsi="Roboto Condensed"/>
+        </w:rPr>
+        <w:t>Rusu</w:t>
+      </w:r>
+      <w:proofErr w:type="spellEnd"/>
+      <w:r>
+        <w:rPr>
+          <w:rFonts w:ascii="Roboto Condensed" w:hAnsi="Roboto Condensed"/>
+        </w:rPr>
+        <w:t xml:space="preserve">, « How to </w:t>
+      </w:r>
+      <w:proofErr w:type="spellStart"/>
+      <w:r>
+        <w:rPr>
+          <w:rFonts w:ascii="Roboto Condensed" w:hAnsi="Roboto Condensed"/>
+        </w:rPr>
+        <w:t>develop</w:t>
+      </w:r>
+      <w:proofErr w:type="spellEnd"/>
+      <w:r>
+        <w:rPr>
+          <w:rFonts w:ascii="Roboto Condensed" w:hAnsi="Roboto Condensed"/>
+        </w:rPr>
+        <w:t xml:space="preserve"> </w:t>
+      </w:r>
+      <w:proofErr w:type="spellStart"/>
+      <w:r>
+        <w:rPr>
+          <w:rFonts w:ascii="Roboto Condensed" w:hAnsi="Roboto Condensed"/>
+        </w:rPr>
+        <w:t>usability</w:t>
+      </w:r>
+      <w:proofErr w:type="spellEnd"/>
+      <w:r>
+        <w:rPr>
+          <w:rFonts w:ascii="Roboto Condensed" w:hAnsi="Roboto Condensed"/>
+        </w:rPr>
+        <w:t xml:space="preserve"> </w:t>
+      </w:r>
+      <w:proofErr w:type="spellStart"/>
+      <w:proofErr w:type="gramStart"/>
+      <w:r>
+        <w:rPr>
+          <w:rFonts w:ascii="Roboto Condensed" w:hAnsi="Roboto Condensed"/>
+        </w:rPr>
+        <w:t>heuristics</w:t>
+      </w:r>
+      <w:proofErr w:type="spellEnd"/>
+      <w:r>
+        <w:rPr>
+          <w:rFonts w:ascii="Roboto Condensed" w:hAnsi="Roboto Condensed"/>
+        </w:rPr>
+        <w:t>:</w:t>
+      </w:r>
+      <w:proofErr w:type="gramEnd"/>
+      <w:r>
+        <w:rPr>
+          <w:rFonts w:ascii="Roboto Condensed" w:hAnsi="Roboto Condensed"/>
+        </w:rPr>
+        <w:t xml:space="preserve"> A </w:t>
+      </w:r>
+      <w:proofErr w:type="spellStart"/>
+      <w:r>
+        <w:rPr>
+          <w:rFonts w:ascii="Roboto Condensed" w:hAnsi="Roboto Condensed"/>
+        </w:rPr>
+        <w:t>systematic</w:t>
+      </w:r>
+      <w:proofErr w:type="spellEnd"/>
+      <w:r>
+        <w:rPr>
+          <w:rFonts w:ascii="Roboto Condensed" w:hAnsi="Roboto Condensed"/>
+        </w:rPr>
+        <w:t xml:space="preserve"> </w:t>
+      </w:r>
+      <w:proofErr w:type="spellStart"/>
+      <w:r>
+        <w:rPr>
+          <w:rFonts w:ascii="Roboto Condensed" w:hAnsi="Roboto Condensed"/>
+        </w:rPr>
+        <w:t>literature</w:t>
+      </w:r>
+      <w:proofErr w:type="spellEnd"/>
+      <w:r>
+        <w:rPr>
+          <w:rFonts w:ascii="Roboto Condensed" w:hAnsi="Roboto Condensed"/>
+        </w:rPr>
+        <w:t xml:space="preserve"> </w:t>
+      </w:r>
+      <w:proofErr w:type="spellStart"/>
+      <w:r>
+        <w:rPr>
+          <w:rFonts w:ascii="Roboto Condensed" w:hAnsi="Roboto Condensed"/>
+        </w:rPr>
+        <w:t>review</w:t>
+      </w:r>
+      <w:proofErr w:type="spellEnd"/>
+      <w:r>
+        <w:rPr>
+          <w:rFonts w:ascii="Roboto Condensed" w:hAnsi="Roboto Condensed"/>
+        </w:rPr>
+        <w:t xml:space="preserve"> », </w:t>
+      </w:r>
+      <w:r>
+        <w:rPr>
+          <w:rFonts w:ascii="Roboto Condensed" w:hAnsi="Roboto Condensed"/>
+          <w:i/>
+          <w:iCs/>
+        </w:rPr>
+        <w:t>Comput. Stand. Interfaces</w:t>
+      </w:r>
+      <w:r>
+        <w:rPr>
+          <w:rFonts w:ascii="Roboto Condensed" w:hAnsi="Roboto Condensed"/>
+        </w:rPr>
+        <w:t>, vol. 53, n</w:t>
+      </w:r>
+      <w:r>
+        <w:rPr>
+          <w:rFonts w:ascii="Roboto Condensed" w:hAnsi="Roboto Condensed"/>
+          <w:vertAlign w:val="superscript"/>
+        </w:rPr>
+        <w:t>o</w:t>
+      </w:r>
+      <w:r>
+        <w:rPr>
+          <w:rFonts w:ascii="Roboto Condensed" w:hAnsi="Roboto Condensed"/>
+        </w:rPr>
+        <w:t xml:space="preserve"> March, p. 89</w:t>
+      </w:r>
+      <w:r>
+        <w:rPr>
+          <w:rFonts w:ascii="Roboto Condensed" w:hAnsi="Roboto Condensed" w:cs="Cambria Math"/>
+        </w:rPr>
+        <w:t>‑</w:t>
+      </w:r>
+      <w:r>
+        <w:rPr>
+          <w:rFonts w:ascii="Roboto Condensed" w:hAnsi="Roboto Condensed"/>
+        </w:rPr>
+        <w:t xml:space="preserve">122, 2017, </w:t>
+      </w:r>
+      <w:proofErr w:type="spellStart"/>
+      <w:proofErr w:type="gramStart"/>
+      <w:r>
+        <w:rPr>
+          <w:rFonts w:ascii="Roboto Condensed" w:hAnsi="Roboto Condensed"/>
+        </w:rPr>
+        <w:t>doi</w:t>
+      </w:r>
+      <w:proofErr w:type="spellEnd"/>
+      <w:r>
+        <w:rPr>
+          <w:rFonts w:ascii="Roboto Condensed" w:hAnsi="Roboto Condensed"/>
+        </w:rPr>
+        <w:t>:</w:t>
+      </w:r>
+      <w:proofErr w:type="gramEnd"/>
+      <w:r>
+        <w:rPr>
+          <w:rFonts w:ascii="Roboto Condensed" w:hAnsi="Roboto Condensed"/>
+        </w:rPr>
+        <w:t xml:space="preserve"> 10.1016/j.csi.2017.03.009.</w:t>
+      </w:r>
+    </w:p>
+    <w:p>
+      <w:pPr>
+        <w:pStyle w:val="Bibliographie"/>
+        <w:rPr>
+          <w:rFonts w:ascii="Roboto Condensed" w:hAnsi="Roboto Condensed"/>
+        </w:rPr>
+      </w:pPr>
+      <w:r>
+        <w:rPr>
+          <w:rFonts w:ascii="Roboto Condensed" w:hAnsi="Roboto Condensed"/>
+        </w:rPr>
+        <w:t>[2]</w:t>
+      </w:r>
+      <w:r>
+        <w:rPr>
+          <w:rFonts w:ascii="Roboto Condensed" w:hAnsi="Roboto Condensed"/>
+        </w:rPr>
+        <w:tab/>
+        <w:t xml:space="preserve">F. Cruz, A. Hassan, et H. Boudaoud, « Les </w:t>
+      </w:r>
+      <w:proofErr w:type="spellStart"/>
+      <w:r>
+        <w:rPr>
+          <w:rFonts w:ascii="Roboto Condensed" w:hAnsi="Roboto Condensed"/>
+        </w:rPr>
+        <w:t>fab</w:t>
+      </w:r>
+      <w:proofErr w:type="spellEnd"/>
+      <w:r>
+        <w:rPr>
+          <w:rFonts w:ascii="Roboto Condensed" w:hAnsi="Roboto Condensed"/>
+        </w:rPr>
+        <w:t xml:space="preserve"> </w:t>
+      </w:r>
+      <w:proofErr w:type="spellStart"/>
+      <w:r>
+        <w:rPr>
+          <w:rFonts w:ascii="Roboto Condensed" w:hAnsi="Roboto Condensed"/>
+        </w:rPr>
+        <w:t>labs</w:t>
+      </w:r>
+      <w:proofErr w:type="spellEnd"/>
+      <w:r>
+        <w:rPr>
+          <w:rFonts w:ascii="Roboto Condensed" w:hAnsi="Roboto Condensed"/>
+        </w:rPr>
+        <w:t xml:space="preserve"> : des lieux de partage pour booster l’innovation », </w:t>
+      </w:r>
+      <w:proofErr w:type="spellStart"/>
+      <w:r>
+        <w:rPr>
+          <w:rFonts w:ascii="Roboto Condensed" w:hAnsi="Roboto Condensed"/>
+          <w:i/>
+          <w:iCs/>
+        </w:rPr>
+        <w:t>Manag</w:t>
+      </w:r>
+      <w:proofErr w:type="spellEnd"/>
+      <w:r>
+        <w:rPr>
+          <w:rFonts w:ascii="Roboto Condensed" w:hAnsi="Roboto Condensed"/>
+          <w:i/>
+          <w:iCs/>
+        </w:rPr>
+        <w:t>. Ingénierie Innov.</w:t>
+      </w:r>
+      <w:r>
+        <w:rPr>
+          <w:rFonts w:ascii="Roboto Condensed" w:hAnsi="Roboto Condensed"/>
+        </w:rPr>
+        <w:t xml:space="preserve">, mars 2023, </w:t>
+      </w:r>
+      <w:proofErr w:type="spellStart"/>
+      <w:proofErr w:type="gramStart"/>
+      <w:r>
+        <w:rPr>
+          <w:rFonts w:ascii="Roboto Condensed" w:hAnsi="Roboto Condensed"/>
+        </w:rPr>
+        <w:t>doi</w:t>
+      </w:r>
+      <w:proofErr w:type="spellEnd"/>
+      <w:r>
+        <w:rPr>
+          <w:rFonts w:ascii="Roboto Condensed" w:hAnsi="Roboto Condensed"/>
+        </w:rPr>
+        <w:t>:</w:t>
+      </w:r>
+      <w:proofErr w:type="gramEnd"/>
+      <w:r>
+        <w:rPr>
+          <w:rFonts w:ascii="Roboto Condensed" w:hAnsi="Roboto Condensed"/>
+        </w:rPr>
+        <w:t xml:space="preserve"> 10.51257/a-v1-ag276.</w:t>
+      </w:r>
+    </w:p>
+    <w:p>
+      <w:pPr>
+        <w:pStyle w:val="Bibliographie"/>
+        <w:rPr>
+          <w:rFonts w:ascii="Roboto Condensed" w:hAnsi="Roboto Condensed"/>
+          <w:lang w:val="en-US"/>
+        </w:rPr>
+      </w:pPr>
+      <w:r>
+        <w:rPr>
+          <w:rFonts w:ascii="Roboto Condensed" w:hAnsi="Roboto Condensed"/>
+          <w:lang w:val="en-US"/>
+        </w:rPr>
+        <w:fldChar w:fldCharType="end"/>
+      </w:r>
+      <w:r>
+        <w:rPr>
+          <w:rFonts w:ascii="Roboto Condensed" w:hAnsi="Roboto Condensed"/>
+          <w:lang w:val="en-US"/>
+        </w:rPr>
+        <w:t xml:space="preserve"> </w:t>
+      </w:r>
+    </w:p>
+    <w:p>
+      <w:pPr>
+        <w:rPr>
+          <w:rFonts w:ascii="Roboto Condensed" w:hAnsi="Roboto Condensed"/>
+          <w:lang w:val="en-US"/>
+        </w:rPr>
       </w:pPr>
     </w:p>
     <w:p>
@@ -6971,7 +7435,7 @@
 </file>
 
 <file path=word/endnotes.xml><?xml version="1.0" encoding="utf-8"?>
-<w:endnotes xmlns:wpc="http://schemas.microsoft.com/office/word/2010/wordprocessingCanvas" xmlns:cx="http://schemas.microsoft.com/office/drawing/2014/chartex" xmlns:cx1="http://schemas.microsoft.com/office/drawing/2015/9/8/chartex" xmlns:cx2="http://schemas.microsoft.com/office/drawing/2015/10/21/chartex" xmlns:cx3="http://schemas.microsoft.com/office/drawing/2016/5/9/chartex" xmlns:cx4="http://schemas.microsoft.com/office/drawing/2016/5/10/chartex" xmlns:cx5="http://schemas.microsoft.com/office/drawing/2016/5/11/chartex" xmlns:cx6="http://schemas.microsoft.com/office/drawing/2016/5/12/chartex" xmlns:cx7="http://schemas.microsoft.com/office/drawing/2016/5/13/chartex" xmlns:cx8="http://schemas.microsoft.com/office/drawing/2016/5/14/chartex" xmlns:mc="http://schemas.openxmlformats.org/markup-compatibility/2006" xmlns:aink="http://schemas.microsoft.com/office/drawing/2016/ink" xmlns:am3d="http://schemas.microsoft.com/office/drawing/2017/model3d" xmlns:o="urn:schemas-microsoft-com:office:office" xmlns:oel="http://schemas.microsoft.com/office/2019/extlst" xmlns:r="http://schemas.openxmlformats.org/officeDocument/2006/relationships" xmlns:m="http://schemas.openxmlformats.org/officeDocument/2006/math" xmlns:v="urn:schemas-microsoft-com:vml" xmlns:wp14="http://schemas.microsoft.com/office/word/2010/wordprocessingDrawing" xmlns:wp="http://schemas.openxmlformats.org/drawingml/2006/wordprocessingDrawing" xmlns:w10="urn:schemas-microsoft-com:office:word" xmlns:w="http://schemas.openxmlformats.org/wordprocessingml/2006/main" xmlns:w14="http://schemas.microsoft.com/office/word/2010/wordml" xmlns:w15="http://schemas.microsoft.com/office/word/2012/wordml" xmlns:w16cex="http://schemas.microsoft.com/office/word/2018/wordml/cex" xmlns:w16cid="http://schemas.microsoft.com/office/word/2016/wordml/cid" xmlns:w16="http://schemas.microsoft.com/office/word/2018/wordml" xmlns:w16du="http://schemas.microsoft.com/office/word/2023/wordml/word16du" xmlns:w16sdtdh="http://schemas.microsoft.com/office/word/2020/wordml/sdtdatahash" xmlns:w16se="http://schemas.microsoft.com/office/word/2015/wordml/symex" xmlns:wpg="http://schemas.microsoft.com/office/word/2010/wordprocessingGroup" xmlns:wpi="http://schemas.microsoft.com/office/word/2010/wordprocessingInk" xmlns:wne="http://schemas.microsoft.com/office/word/2006/wordml" xmlns:wps="http://schemas.microsoft.com/office/word/2010/wordprocessingShape" mc:Ignorable="w14 w15 w16se w16cid w16 w16cex w16sdtdh w16du wp14">
+<w:endnotes xmlns:wpc="http://schemas.microsoft.com/office/word/2010/wordprocessingCanvas" xmlns:cx="http://schemas.microsoft.com/office/drawing/2014/chartex" xmlns:cx1="http://schemas.microsoft.com/office/drawing/2015/9/8/chartex" xmlns:cx2="http://schemas.microsoft.com/office/drawing/2015/10/21/chartex" xmlns:cx3="http://schemas.microsoft.com/office/drawing/2016/5/9/chartex" xmlns:cx4="http://schemas.microsoft.com/office/drawing/2016/5/10/chartex" xmlns:cx5="http://schemas.microsoft.com/office/drawing/2016/5/11/chartex" xmlns:cx6="http://schemas.microsoft.com/office/drawing/2016/5/12/chartex" xmlns:cx7="http://schemas.microsoft.com/office/drawing/2016/5/13/chartex" xmlns:cx8="http://schemas.microsoft.com/office/drawing/2016/5/14/chartex" xmlns:mc="http://schemas.openxmlformats.org/markup-compatibility/2006" xmlns:aink="http://schemas.microsoft.com/office/drawing/2016/ink" xmlns:am3d="http://schemas.microsoft.com/office/drawing/2017/model3d" xmlns:o="urn:schemas-microsoft-com:office:office" xmlns:oel="http://schemas.microsoft.com/office/2019/extlst" xmlns:r="http://schemas.openxmlformats.org/officeDocument/2006/relationships" xmlns:m="http://schemas.openxmlformats.org/officeDocument/2006/math" xmlns:v="urn:schemas-microsoft-com:vml" xmlns:wp14="http://schemas.microsoft.com/office/word/2010/wordprocessingDrawing" xmlns:wp="http://schemas.openxmlformats.org/drawingml/2006/wordprocessingDrawing" xmlns:w10="urn:schemas-microsoft-com:office:word" xmlns:w="http://schemas.openxmlformats.org/wordprocessingml/2006/main" xmlns:w14="http://schemas.microsoft.com/office/word/2010/wordml" xmlns:w15="http://schemas.microsoft.com/office/word/2012/wordml" xmlns:w16cex="http://schemas.microsoft.com/office/word/2018/wordml/cex" xmlns:w16cid="http://schemas.microsoft.com/office/word/2016/wordml/cid" xmlns:w16="http://schemas.microsoft.com/office/word/2018/wordml" xmlns:w16du="http://schemas.microsoft.com/office/word/2023/wordml/word16du" xmlns:w16sdtdh="http://schemas.microsoft.com/office/word/2020/wordml/sdtdatahash" xmlns:w16sdtfl="http://schemas.microsoft.com/office/word/2024/wordml/sdtformatlock" xmlns:w16se="http://schemas.microsoft.com/office/word/2015/wordml/symex" xmlns:wpg="http://schemas.microsoft.com/office/word/2010/wordprocessingGroup" xmlns:wpi="http://schemas.microsoft.com/office/word/2010/wordprocessingInk" xmlns:wne="http://schemas.microsoft.com/office/word/2006/wordml" xmlns:wps="http://schemas.microsoft.com/office/word/2010/wordprocessingShape" mc:Ignorable="w14 w15 w16se w16cid w16 w16cex w16sdtdh w16sdtfl w16du wp14">
   <w:endnote w:type="separator" w:id="-1">
     <w:p>
       <w:pPr>
@@ -6996,7 +7460,7 @@
 </file>
 
 <file path=word/footer1.xml><?xml version="1.0" encoding="utf-8"?>
-<w:ftr xmlns:wpc="http://schemas.microsoft.com/office/word/2010/wordprocessingCanvas" xmlns:cx="http://schemas.microsoft.com/office/drawing/2014/chartex" xmlns:cx1="http://schemas.microsoft.com/office/drawing/2015/9/8/chartex" xmlns:cx2="http://schemas.microsoft.com/office/drawing/2015/10/21/chartex" xmlns:cx3="http://schemas.microsoft.com/office/drawing/2016/5/9/chartex" xmlns:cx4="http://schemas.microsoft.com/office/drawing/2016/5/10/chartex" xmlns:cx5="http://schemas.microsoft.com/office/drawing/2016/5/11/chartex" xmlns:cx6="http://schemas.microsoft.com/office/drawing/2016/5/12/chartex" xmlns:cx7="http://schemas.microsoft.com/office/drawing/2016/5/13/chartex" xmlns:cx8="http://schemas.microsoft.com/office/drawing/2016/5/14/chartex" xmlns:mc="http://schemas.openxmlformats.org/markup-compatibility/2006" xmlns:aink="http://schemas.microsoft.com/office/drawing/2016/ink" xmlns:am3d="http://schemas.microsoft.com/office/drawing/2017/model3d" xmlns:o="urn:schemas-microsoft-com:office:office" xmlns:oel="http://schemas.microsoft.com/office/2019/extlst" xmlns:r="http://schemas.openxmlformats.org/officeDocument/2006/relationships" xmlns:m="http://schemas.openxmlformats.org/officeDocument/2006/math" xmlns:v="urn:schemas-microsoft-com:vml" xmlns:wp14="http://schemas.microsoft.com/office/word/2010/wordprocessingDrawing" xmlns:wp="http://schemas.openxmlformats.org/drawingml/2006/wordprocessingDrawing" xmlns:w10="urn:schemas-microsoft-com:office:word" xmlns:w="http://schemas.openxmlformats.org/wordprocessingml/2006/main" xmlns:w14="http://schemas.microsoft.com/office/word/2010/wordml" xmlns:w15="http://schemas.microsoft.com/office/word/2012/wordml" xmlns:w16cex="http://schemas.microsoft.com/office/word/2018/wordml/cex" xmlns:w16cid="http://schemas.microsoft.com/office/word/2016/wordml/cid" xmlns:w16="http://schemas.microsoft.com/office/word/2018/wordml" xmlns:w16du="http://schemas.microsoft.com/office/word/2023/wordml/word16du" xmlns:w16sdtdh="http://schemas.microsoft.com/office/word/2020/wordml/sdtdatahash" xmlns:w16se="http://schemas.microsoft.com/office/word/2015/wordml/symex" xmlns:wpg="http://schemas.microsoft.com/office/word/2010/wordprocessingGroup" xmlns:wpi="http://schemas.microsoft.com/office/word/2010/wordprocessingInk" xmlns:wne="http://schemas.microsoft.com/office/word/2006/wordml" xmlns:wps="http://schemas.microsoft.com/office/word/2010/wordprocessingShape" mc:Ignorable="w14 w15 w16se w16cid w16 w16cex w16sdtdh w16du wp14">
+<w:ftr xmlns:wpc="http://schemas.microsoft.com/office/word/2010/wordprocessingCanvas" xmlns:cx="http://schemas.microsoft.com/office/drawing/2014/chartex" xmlns:cx1="http://schemas.microsoft.com/office/drawing/2015/9/8/chartex" xmlns:cx2="http://schemas.microsoft.com/office/drawing/2015/10/21/chartex" xmlns:cx3="http://schemas.microsoft.com/office/drawing/2016/5/9/chartex" xmlns:cx4="http://schemas.microsoft.com/office/drawing/2016/5/10/chartex" xmlns:cx5="http://schemas.microsoft.com/office/drawing/2016/5/11/chartex" xmlns:cx6="http://schemas.microsoft.com/office/drawing/2016/5/12/chartex" xmlns:cx7="http://schemas.microsoft.com/office/drawing/2016/5/13/chartex" xmlns:cx8="http://schemas.microsoft.com/office/drawing/2016/5/14/chartex" xmlns:mc="http://schemas.openxmlformats.org/markup-compatibility/2006" xmlns:aink="http://schemas.microsoft.com/office/drawing/2016/ink" xmlns:am3d="http://schemas.microsoft.com/office/drawing/2017/model3d" xmlns:o="urn:schemas-microsoft-com:office:office" xmlns:oel="http://schemas.microsoft.com/office/2019/extlst" xmlns:r="http://schemas.openxmlformats.org/officeDocument/2006/relationships" xmlns:m="http://schemas.openxmlformats.org/officeDocument/2006/math" xmlns:v="urn:schemas-microsoft-com:vml" xmlns:wp14="http://schemas.microsoft.com/office/word/2010/wordprocessingDrawing" xmlns:wp="http://schemas.openxmlformats.org/drawingml/2006/wordprocessingDrawing" xmlns:w10="urn:schemas-microsoft-com:office:word" xmlns:w="http://schemas.openxmlformats.org/wordprocessingml/2006/main" xmlns:w14="http://schemas.microsoft.com/office/word/2010/wordml" xmlns:w15="http://schemas.microsoft.com/office/word/2012/wordml" xmlns:w16cex="http://schemas.microsoft.com/office/word/2018/wordml/cex" xmlns:w16cid="http://schemas.microsoft.com/office/word/2016/wordml/cid" xmlns:w16="http://schemas.microsoft.com/office/word/2018/wordml" xmlns:w16du="http://schemas.microsoft.com/office/word/2023/wordml/word16du" xmlns:w16sdtdh="http://schemas.microsoft.com/office/word/2020/wordml/sdtdatahash" xmlns:w16sdtfl="http://schemas.microsoft.com/office/word/2024/wordml/sdtformatlock" xmlns:w16se="http://schemas.microsoft.com/office/word/2015/wordml/symex" xmlns:wpg="http://schemas.microsoft.com/office/word/2010/wordprocessingGroup" xmlns:wpi="http://schemas.microsoft.com/office/word/2010/wordprocessingInk" xmlns:wne="http://schemas.microsoft.com/office/word/2006/wordml" xmlns:wps="http://schemas.microsoft.com/office/word/2010/wordprocessingShape" mc:Ignorable="w14 w15 w16se w16cid w16 w16cex w16sdtdh w16sdtfl w16du wp14">
   <w:p>
     <w:pPr>
       <w:pStyle w:val="Pieddepage"/>
@@ -7192,7 +7656,7 @@
 </file>
 
 <file path=word/footer2.xml><?xml version="1.0" encoding="utf-8"?>
-<w:ftr xmlns:wpc="http://schemas.microsoft.com/office/word/2010/wordprocessingCanvas" xmlns:cx="http://schemas.microsoft.com/office/drawing/2014/chartex" xmlns:cx1="http://schemas.microsoft.com/office/drawing/2015/9/8/chartex" xmlns:cx2="http://schemas.microsoft.com/office/drawing/2015/10/21/chartex" xmlns:cx3="http://schemas.microsoft.com/office/drawing/2016/5/9/chartex" xmlns:cx4="http://schemas.microsoft.com/office/drawing/2016/5/10/chartex" xmlns:cx5="http://schemas.microsoft.com/office/drawing/2016/5/11/chartex" xmlns:cx6="http://schemas.microsoft.com/office/drawing/2016/5/12/chartex" xmlns:cx7="http://schemas.microsoft.com/office/drawing/2016/5/13/chartex" xmlns:cx8="http://schemas.microsoft.com/office/drawing/2016/5/14/chartex" xmlns:mc="http://schemas.openxmlformats.org/markup-compatibility/2006" xmlns:aink="http://schemas.microsoft.com/office/drawing/2016/ink" xmlns:am3d="http://schemas.microsoft.com/office/drawing/2017/model3d" xmlns:o="urn:schemas-microsoft-com:office:office" xmlns:oel="http://schemas.microsoft.com/office/2019/extlst" xmlns:r="http://schemas.openxmlformats.org/officeDocument/2006/relationships" xmlns:m="http://schemas.openxmlformats.org/officeDocument/2006/math" xmlns:v="urn:schemas-microsoft-com:vml" xmlns:wp14="http://schemas.microsoft.com/office/word/2010/wordprocessingDrawing" xmlns:wp="http://schemas.openxmlformats.org/drawingml/2006/wordprocessingDrawing" xmlns:w10="urn:schemas-microsoft-com:office:word" xmlns:w="http://schemas.openxmlformats.org/wordprocessingml/2006/main" xmlns:w14="http://schemas.microsoft.com/office/word/2010/wordml" xmlns:w15="http://schemas.microsoft.com/office/word/2012/wordml" xmlns:w16cex="http://schemas.microsoft.com/office/word/2018/wordml/cex" xmlns:w16cid="http://schemas.microsoft.com/office/word/2016/wordml/cid" xmlns:w16="http://schemas.microsoft.com/office/word/2018/wordml" xmlns:w16du="http://schemas.microsoft.com/office/word/2023/wordml/word16du" xmlns:w16sdtdh="http://schemas.microsoft.com/office/word/2020/wordml/sdtdatahash" xmlns:w16se="http://schemas.microsoft.com/office/word/2015/wordml/symex" xmlns:wpg="http://schemas.microsoft.com/office/word/2010/wordprocessingGroup" xmlns:wpi="http://schemas.microsoft.com/office/word/2010/wordprocessingInk" xmlns:wne="http://schemas.microsoft.com/office/word/2006/wordml" xmlns:wps="http://schemas.microsoft.com/office/word/2010/wordprocessingShape" mc:Ignorable="w14 w15 w16se w16cid w16 w16cex w16sdtdh w16du wp14">
+<w:ftr xmlns:wpc="http://schemas.microsoft.com/office/word/2010/wordprocessingCanvas" xmlns:cx="http://schemas.microsoft.com/office/drawing/2014/chartex" xmlns:cx1="http://schemas.microsoft.com/office/drawing/2015/9/8/chartex" xmlns:cx2="http://schemas.microsoft.com/office/drawing/2015/10/21/chartex" xmlns:cx3="http://schemas.microsoft.com/office/drawing/2016/5/9/chartex" xmlns:cx4="http://schemas.microsoft.com/office/drawing/2016/5/10/chartex" xmlns:cx5="http://schemas.microsoft.com/office/drawing/2016/5/11/chartex" xmlns:cx6="http://schemas.microsoft.com/office/drawing/2016/5/12/chartex" xmlns:cx7="http://schemas.microsoft.com/office/drawing/2016/5/13/chartex" xmlns:cx8="http://schemas.microsoft.com/office/drawing/2016/5/14/chartex" xmlns:mc="http://schemas.openxmlformats.org/markup-compatibility/2006" xmlns:aink="http://schemas.microsoft.com/office/drawing/2016/ink" xmlns:am3d="http://schemas.microsoft.com/office/drawing/2017/model3d" xmlns:o="urn:schemas-microsoft-com:office:office" xmlns:oel="http://schemas.microsoft.com/office/2019/extlst" xmlns:r="http://schemas.openxmlformats.org/officeDocument/2006/relationships" xmlns:m="http://schemas.openxmlformats.org/officeDocument/2006/math" xmlns:v="urn:schemas-microsoft-com:vml" xmlns:wp14="http://schemas.microsoft.com/office/word/2010/wordprocessingDrawing" xmlns:wp="http://schemas.openxmlformats.org/drawingml/2006/wordprocessingDrawing" xmlns:w10="urn:schemas-microsoft-com:office:word" xmlns:w="http://schemas.openxmlformats.org/wordprocessingml/2006/main" xmlns:w14="http://schemas.microsoft.com/office/word/2010/wordml" xmlns:w15="http://schemas.microsoft.com/office/word/2012/wordml" xmlns:w16cex="http://schemas.microsoft.com/office/word/2018/wordml/cex" xmlns:w16cid="http://schemas.microsoft.com/office/word/2016/wordml/cid" xmlns:w16="http://schemas.microsoft.com/office/word/2018/wordml" xmlns:w16du="http://schemas.microsoft.com/office/word/2023/wordml/word16du" xmlns:w16sdtdh="http://schemas.microsoft.com/office/word/2020/wordml/sdtdatahash" xmlns:w16sdtfl="http://schemas.microsoft.com/office/word/2024/wordml/sdtformatlock" xmlns:w16se="http://schemas.microsoft.com/office/word/2015/wordml/symex" xmlns:wpg="http://schemas.microsoft.com/office/word/2010/wordprocessingGroup" xmlns:wpi="http://schemas.microsoft.com/office/word/2010/wordprocessingInk" xmlns:wne="http://schemas.microsoft.com/office/word/2006/wordml" xmlns:wps="http://schemas.microsoft.com/office/word/2010/wordprocessingShape" mc:Ignorable="w14 w15 w16se w16cid w16 w16cex w16sdtdh w16sdtfl w16du wp14">
   <w:p>
     <w:pPr>
       <w:pStyle w:val="Pieddepage"/>
@@ -7303,7 +7767,7 @@
 </file>
 
 <file path=word/footnotes.xml><?xml version="1.0" encoding="utf-8"?>
-<w:footnotes xmlns:wpc="http://schemas.microsoft.com/office/word/2010/wordprocessingCanvas" xmlns:cx="http://schemas.microsoft.com/office/drawing/2014/chartex" xmlns:cx1="http://schemas.microsoft.com/office/drawing/2015/9/8/chartex" xmlns:cx2="http://schemas.microsoft.com/office/drawing/2015/10/21/chartex" xmlns:cx3="http://schemas.microsoft.com/office/drawing/2016/5/9/chartex" xmlns:cx4="http://schemas.microsoft.com/office/drawing/2016/5/10/chartex" xmlns:cx5="http://schemas.microsoft.com/office/drawing/2016/5/11/chartex" xmlns:cx6="http://schemas.microsoft.com/office/drawing/2016/5/12/chartex" xmlns:cx7="http://schemas.microsoft.com/office/drawing/2016/5/13/chartex" xmlns:cx8="http://schemas.microsoft.com/office/drawing/2016/5/14/chartex" xmlns:mc="http://schemas.openxmlformats.org/markup-compatibility/2006" xmlns:aink="http://schemas.microsoft.com/office/drawing/2016/ink" xmlns:am3d="http://schemas.microsoft.com/office/drawing/2017/model3d" xmlns:o="urn:schemas-microsoft-com:office:office" xmlns:oel="http://schemas.microsoft.com/office/2019/extlst" xmlns:r="http://schemas.openxmlformats.org/officeDocument/2006/relationships" xmlns:m="http://schemas.openxmlformats.org/officeDocument/2006/math" xmlns:v="urn:schemas-microsoft-com:vml" xmlns:wp14="http://schemas.microsoft.com/office/word/2010/wordprocessingDrawing" xmlns:wp="http://schemas.openxmlformats.org/drawingml/2006/wordprocessingDrawing" xmlns:w10="urn:schemas-microsoft-com:office:word" xmlns:w="http://schemas.openxmlformats.org/wordprocessingml/2006/main" xmlns:w14="http://schemas.microsoft.com/office/word/2010/wordml" xmlns:w15="http://schemas.microsoft.com/office/word/2012/wordml" xmlns:w16cex="http://schemas.microsoft.com/office/word/2018/wordml/cex" xmlns:w16cid="http://schemas.microsoft.com/office/word/2016/wordml/cid" xmlns:w16="http://schemas.microsoft.com/office/word/2018/wordml" xmlns:w16du="http://schemas.microsoft.com/office/word/2023/wordml/word16du" xmlns:w16sdtdh="http://schemas.microsoft.com/office/word/2020/wordml/sdtdatahash" xmlns:w16se="http://schemas.microsoft.com/office/word/2015/wordml/symex" xmlns:wpg="http://schemas.microsoft.com/office/word/2010/wordprocessingGroup" xmlns:wpi="http://schemas.microsoft.com/office/word/2010/wordprocessingInk" xmlns:wne="http://schemas.microsoft.com/office/word/2006/wordml" xmlns:wps="http://schemas.microsoft.com/office/word/2010/wordprocessingShape" mc:Ignorable="w14 w15 w16se w16cid w16 w16cex w16sdtdh w16du wp14">
+<w:footnotes xmlns:wpc="http://schemas.microsoft.com/office/word/2010/wordprocessingCanvas" xmlns:cx="http://schemas.microsoft.com/office/drawing/2014/chartex" xmlns:cx1="http://schemas.microsoft.com/office/drawing/2015/9/8/chartex" xmlns:cx2="http://schemas.microsoft.com/office/drawing/2015/10/21/chartex" xmlns:cx3="http://schemas.microsoft.com/office/drawing/2016/5/9/chartex" xmlns:cx4="http://schemas.microsoft.com/office/drawing/2016/5/10/chartex" xmlns:cx5="http://schemas.microsoft.com/office/drawing/2016/5/11/chartex" xmlns:cx6="http://schemas.microsoft.com/office/drawing/2016/5/12/chartex" xmlns:cx7="http://schemas.microsoft.com/office/drawing/2016/5/13/chartex" xmlns:cx8="http://schemas.microsoft.com/office/drawing/2016/5/14/chartex" xmlns:mc="http://schemas.openxmlformats.org/markup-compatibility/2006" xmlns:aink="http://schemas.microsoft.com/office/drawing/2016/ink" xmlns:am3d="http://schemas.microsoft.com/office/drawing/2017/model3d" xmlns:o="urn:schemas-microsoft-com:office:office" xmlns:oel="http://schemas.microsoft.com/office/2019/extlst" xmlns:r="http://schemas.openxmlformats.org/officeDocument/2006/relationships" xmlns:m="http://schemas.openxmlformats.org/officeDocument/2006/math" xmlns:v="urn:schemas-microsoft-com:vml" xmlns:wp14="http://schemas.microsoft.com/office/word/2010/wordprocessingDrawing" xmlns:wp="http://schemas.openxmlformats.org/drawingml/2006/wordprocessingDrawing" xmlns:w10="urn:schemas-microsoft-com:office:word" xmlns:w="http://schemas.openxmlformats.org/wordprocessingml/2006/main" xmlns:w14="http://schemas.microsoft.com/office/word/2010/wordml" xmlns:w15="http://schemas.microsoft.com/office/word/2012/wordml" xmlns:w16cex="http://schemas.microsoft.com/office/word/2018/wordml/cex" xmlns:w16cid="http://schemas.microsoft.com/office/word/2016/wordml/cid" xmlns:w16="http://schemas.microsoft.com/office/word/2018/wordml" xmlns:w16du="http://schemas.microsoft.com/office/word/2023/wordml/word16du" xmlns:w16sdtdh="http://schemas.microsoft.com/office/word/2020/wordml/sdtdatahash" xmlns:w16sdtfl="http://schemas.microsoft.com/office/word/2024/wordml/sdtformatlock" xmlns:w16se="http://schemas.microsoft.com/office/word/2015/wordml/symex" xmlns:wpg="http://schemas.microsoft.com/office/word/2010/wordprocessingGroup" xmlns:wpi="http://schemas.microsoft.com/office/word/2010/wordprocessingInk" xmlns:wne="http://schemas.microsoft.com/office/word/2006/wordml" xmlns:wps="http://schemas.microsoft.com/office/word/2010/wordprocessingShape" mc:Ignorable="w14 w15 w16se w16cid w16 w16cex w16sdtdh w16sdtfl w16du wp14">
   <w:footnote w:type="separator" w:id="-1">
     <w:p>
       <w:pPr>
@@ -7328,7 +7792,7 @@
 </file>
 
 <file path=word/header1.xml><?xml version="1.0" encoding="utf-8"?>
-<w:hdr xmlns:wpc="http://schemas.microsoft.com/office/word/2010/wordprocessingCanvas" xmlns:cx="http://schemas.microsoft.com/office/drawing/2014/chartex" xmlns:cx1="http://schemas.microsoft.com/office/drawing/2015/9/8/chartex" xmlns:cx2="http://schemas.microsoft.com/office/drawing/2015/10/21/chartex" xmlns:cx3="http://schemas.microsoft.com/office/drawing/2016/5/9/chartex" xmlns:cx4="http://schemas.microsoft.com/office/drawing/2016/5/10/chartex" xmlns:cx5="http://schemas.microsoft.com/office/drawing/2016/5/11/chartex" xmlns:cx6="http://schemas.microsoft.com/office/drawing/2016/5/12/chartex" xmlns:cx7="http://schemas.microsoft.com/office/drawing/2016/5/13/chartex" xmlns:cx8="http://schemas.microsoft.com/office/drawing/2016/5/14/chartex" xmlns:mc="http://schemas.openxmlformats.org/markup-compatibility/2006" xmlns:aink="http://schemas.microsoft.com/office/drawing/2016/ink" xmlns:am3d="http://schemas.microsoft.com/office/drawing/2017/model3d" xmlns:o="urn:schemas-microsoft-com:office:office" xmlns:oel="http://schemas.microsoft.com/office/2019/extlst" xmlns:r="http://schemas.openxmlformats.org/officeDocument/2006/relationships" xmlns:m="http://schemas.openxmlformats.org/officeDocument/2006/math" xmlns:v="urn:schemas-microsoft-com:vml" xmlns:wp14="http://schemas.microsoft.com/office/word/2010/wordprocessingDrawing" xmlns:wp="http://schemas.openxmlformats.org/drawingml/2006/wordprocessingDrawing" xmlns:w10="urn:schemas-microsoft-com:office:word" xmlns:w="http://schemas.openxmlformats.org/wordprocessingml/2006/main" xmlns:w14="http://schemas.microsoft.com/office/word/2010/wordml" xmlns:w15="http://schemas.microsoft.com/office/word/2012/wordml" xmlns:w16cex="http://schemas.microsoft.com/office/word/2018/wordml/cex" xmlns:w16cid="http://schemas.microsoft.com/office/word/2016/wordml/cid" xmlns:w16="http://schemas.microsoft.com/office/word/2018/wordml" xmlns:w16du="http://schemas.microsoft.com/office/word/2023/wordml/word16du" xmlns:w16sdtdh="http://schemas.microsoft.com/office/word/2020/wordml/sdtdatahash" xmlns:w16se="http://schemas.microsoft.com/office/word/2015/wordml/symex" xmlns:wpg="http://schemas.microsoft.com/office/word/2010/wordprocessingGroup" xmlns:wpi="http://schemas.microsoft.com/office/word/2010/wordprocessingInk" xmlns:wne="http://schemas.microsoft.com/office/word/2006/wordml" xmlns:wps="http://schemas.microsoft.com/office/word/2010/wordprocessingShape" mc:Ignorable="w14 w15 w16se w16cid w16 w16cex w16sdtdh w16du wp14">
+<w:hdr xmlns:wpc="http://schemas.microsoft.com/office/word/2010/wordprocessingCanvas" xmlns:cx="http://schemas.microsoft.com/office/drawing/2014/chartex" xmlns:cx1="http://schemas.microsoft.com/office/drawing/2015/9/8/chartex" xmlns:cx2="http://schemas.microsoft.com/office/drawing/2015/10/21/chartex" xmlns:cx3="http://schemas.microsoft.com/office/drawing/2016/5/9/chartex" xmlns:cx4="http://schemas.microsoft.com/office/drawing/2016/5/10/chartex" xmlns:cx5="http://schemas.microsoft.com/office/drawing/2016/5/11/chartex" xmlns:cx6="http://schemas.microsoft.com/office/drawing/2016/5/12/chartex" xmlns:cx7="http://schemas.microsoft.com/office/drawing/2016/5/13/chartex" xmlns:cx8="http://schemas.microsoft.com/office/drawing/2016/5/14/chartex" xmlns:mc="http://schemas.openxmlformats.org/markup-compatibility/2006" xmlns:aink="http://schemas.microsoft.com/office/drawing/2016/ink" xmlns:am3d="http://schemas.microsoft.com/office/drawing/2017/model3d" xmlns:o="urn:schemas-microsoft-com:office:office" xmlns:oel="http://schemas.microsoft.com/office/2019/extlst" xmlns:r="http://schemas.openxmlformats.org/officeDocument/2006/relationships" xmlns:m="http://schemas.openxmlformats.org/officeDocument/2006/math" xmlns:v="urn:schemas-microsoft-com:vml" xmlns:wp14="http://schemas.microsoft.com/office/word/2010/wordprocessingDrawing" xmlns:wp="http://schemas.openxmlformats.org/drawingml/2006/wordprocessingDrawing" xmlns:w10="urn:schemas-microsoft-com:office:word" xmlns:w="http://schemas.openxmlformats.org/wordprocessingml/2006/main" xmlns:w14="http://schemas.microsoft.com/office/word/2010/wordml" xmlns:w15="http://schemas.microsoft.com/office/word/2012/wordml" xmlns:w16cex="http://schemas.microsoft.com/office/word/2018/wordml/cex" xmlns:w16cid="http://schemas.microsoft.com/office/word/2016/wordml/cid" xmlns:w16="http://schemas.microsoft.com/office/word/2018/wordml" xmlns:w16du="http://schemas.microsoft.com/office/word/2023/wordml/word16du" xmlns:w16sdtdh="http://schemas.microsoft.com/office/word/2020/wordml/sdtdatahash" xmlns:w16sdtfl="http://schemas.microsoft.com/office/word/2024/wordml/sdtformatlock" xmlns:w16se="http://schemas.microsoft.com/office/word/2015/wordml/symex" xmlns:wpg="http://schemas.microsoft.com/office/word/2010/wordprocessingGroup" xmlns:wpi="http://schemas.microsoft.com/office/word/2010/wordprocessingInk" xmlns:wne="http://schemas.microsoft.com/office/word/2006/wordml" xmlns:wps="http://schemas.microsoft.com/office/word/2010/wordprocessingShape" mc:Ignorable="w14 w15 w16se w16cid w16 w16cex w16sdtdh w16sdtfl w16du wp14">
   <w:p>
     <w:pPr>
       <w:pStyle w:val="En-tte"/>
@@ -7537,7 +8001,7 @@
 </file>
 
 <file path=word/numbering.xml><?xml version="1.0" encoding="utf-8"?>
-<w:numbering xmlns:wpc="http://schemas.microsoft.com/office/word/2010/wordprocessingCanvas" xmlns:cx="http://schemas.microsoft.com/office/drawing/2014/chartex" xmlns:cx1="http://schemas.microsoft.com/office/drawing/2015/9/8/chartex" xmlns:cx2="http://schemas.microsoft.com/office/drawing/2015/10/21/chartex" xmlns:cx3="http://schemas.microsoft.com/office/drawing/2016/5/9/chartex" xmlns:cx4="http://schemas.microsoft.com/office/drawing/2016/5/10/chartex" xmlns:cx5="http://schemas.microsoft.com/office/drawing/2016/5/11/chartex" xmlns:cx6="http://schemas.microsoft.com/office/drawing/2016/5/12/chartex" xmlns:cx7="http://schemas.microsoft.com/office/drawing/2016/5/13/chartex" xmlns:cx8="http://schemas.microsoft.com/office/drawing/2016/5/14/chartex" xmlns:mc="http://schemas.openxmlformats.org/markup-compatibility/2006" xmlns:aink="http://schemas.microsoft.com/office/drawing/2016/ink" xmlns:am3d="http://schemas.microsoft.com/office/drawing/2017/model3d" xmlns:o="urn:schemas-microsoft-com:office:office" xmlns:oel="http://schemas.microsoft.com/office/2019/extlst" xmlns:r="http://schemas.openxmlformats.org/officeDocument/2006/relationships" xmlns:m="http://schemas.openxmlformats.org/officeDocument/2006/math" xmlns:v="urn:schemas-microsoft-com:vml" xmlns:wp14="http://schemas.microsoft.com/office/word/2010/wordprocessingDrawing" xmlns:wp="http://schemas.openxmlformats.org/drawingml/2006/wordprocessingDrawing" xmlns:w10="urn:schemas-microsoft-com:office:word" xmlns:w="http://schemas.openxmlformats.org/wordprocessingml/2006/main" xmlns:w14="http://schemas.microsoft.com/office/word/2010/wordml" xmlns:w15="http://schemas.microsoft.com/office/word/2012/wordml" xmlns:w16cex="http://schemas.microsoft.com/office/word/2018/wordml/cex" xmlns:w16cid="http://schemas.microsoft.com/office/word/2016/wordml/cid" xmlns:w16="http://schemas.microsoft.com/office/word/2018/wordml" xmlns:w16du="http://schemas.microsoft.com/office/word/2023/wordml/word16du" xmlns:w16sdtdh="http://schemas.microsoft.com/office/word/2020/wordml/sdtdatahash" xmlns:w16se="http://schemas.microsoft.com/office/word/2015/wordml/symex" xmlns:wpg="http://schemas.microsoft.com/office/word/2010/wordprocessingGroup" xmlns:wpi="http://schemas.microsoft.com/office/word/2010/wordprocessingInk" xmlns:wne="http://schemas.microsoft.com/office/word/2006/wordml" xmlns:wps="http://schemas.microsoft.com/office/word/2010/wordprocessingShape" mc:Ignorable="w14 w15 w16se w16cid w16 w16cex w16sdtdh w16du wp14">
+<w:numbering xmlns:wpc="http://schemas.microsoft.com/office/word/2010/wordprocessingCanvas" xmlns:cx="http://schemas.microsoft.com/office/drawing/2014/chartex" xmlns:cx1="http://schemas.microsoft.com/office/drawing/2015/9/8/chartex" xmlns:cx2="http://schemas.microsoft.com/office/drawing/2015/10/21/chartex" xmlns:cx3="http://schemas.microsoft.com/office/drawing/2016/5/9/chartex" xmlns:cx4="http://schemas.microsoft.com/office/drawing/2016/5/10/chartex" xmlns:cx5="http://schemas.microsoft.com/office/drawing/2016/5/11/chartex" xmlns:cx6="http://schemas.microsoft.com/office/drawing/2016/5/12/chartex" xmlns:cx7="http://schemas.microsoft.com/office/drawing/2016/5/13/chartex" xmlns:cx8="http://schemas.microsoft.com/office/drawing/2016/5/14/chartex" xmlns:mc="http://schemas.openxmlformats.org/markup-compatibility/2006" xmlns:aink="http://schemas.microsoft.com/office/drawing/2016/ink" xmlns:am3d="http://schemas.microsoft.com/office/drawing/2017/model3d" xmlns:o="urn:schemas-microsoft-com:office:office" xmlns:oel="http://schemas.microsoft.com/office/2019/extlst" xmlns:r="http://schemas.openxmlformats.org/officeDocument/2006/relationships" xmlns:m="http://schemas.openxmlformats.org/officeDocument/2006/math" xmlns:v="urn:schemas-microsoft-com:vml" xmlns:wp14="http://schemas.microsoft.com/office/word/2010/wordprocessingDrawing" xmlns:wp="http://schemas.openxmlformats.org/drawingml/2006/wordprocessingDrawing" xmlns:w10="urn:schemas-microsoft-com:office:word" xmlns:w="http://schemas.openxmlformats.org/wordprocessingml/2006/main" xmlns:w14="http://schemas.microsoft.com/office/word/2010/wordml" xmlns:w15="http://schemas.microsoft.com/office/word/2012/wordml" xmlns:w16cex="http://schemas.microsoft.com/office/word/2018/wordml/cex" xmlns:w16cid="http://schemas.microsoft.com/office/word/2016/wordml/cid" xmlns:w16="http://schemas.microsoft.com/office/word/2018/wordml" xmlns:w16du="http://schemas.microsoft.com/office/word/2023/wordml/word16du" xmlns:w16sdtdh="http://schemas.microsoft.com/office/word/2020/wordml/sdtdatahash" xmlns:w16sdtfl="http://schemas.microsoft.com/office/word/2024/wordml/sdtformatlock" xmlns:w16se="http://schemas.microsoft.com/office/word/2015/wordml/symex" xmlns:wpg="http://schemas.microsoft.com/office/word/2010/wordprocessingGroup" xmlns:wpi="http://schemas.microsoft.com/office/word/2010/wordprocessingInk" xmlns:wne="http://schemas.microsoft.com/office/word/2006/wordml" xmlns:wps="http://schemas.microsoft.com/office/word/2010/wordprocessingShape" mc:Ignorable="w14 w15 w16se w16cid w16 w16cex w16sdtdh w16sdtfl w16du wp14">
   <w:abstractNum w:abstractNumId="0" w15:restartNumberingAfterBreak="0">
     <w:nsid w:val="0DB100E3"/>
     <w:multiLevelType w:val="hybridMultilevel"/>
@@ -8320,7 +8784,7 @@
 </file>
 
 <file path=word/styles.xml><?xml version="1.0" encoding="utf-8"?>
-<w:styles xmlns:mc="http://schemas.openxmlformats.org/markup-compatibility/2006" xmlns:r="http://schemas.openxmlformats.org/officeDocument/2006/relationships" xmlns:w="http://schemas.openxmlformats.org/wordprocessingml/2006/main" xmlns:w14="http://schemas.microsoft.com/office/word/2010/wordml" xmlns:w15="http://schemas.microsoft.com/office/word/2012/wordml" xmlns:w16cex="http://schemas.microsoft.com/office/word/2018/wordml/cex" xmlns:w16cid="http://schemas.microsoft.com/office/word/2016/wordml/cid" xmlns:w16="http://schemas.microsoft.com/office/word/2018/wordml" xmlns:w16du="http://schemas.microsoft.com/office/word/2023/wordml/word16du" xmlns:w16sdtdh="http://schemas.microsoft.com/office/word/2020/wordml/sdtdatahash" xmlns:w16se="http://schemas.microsoft.com/office/word/2015/wordml/symex" mc:Ignorable="w14 w15 w16se w16cid w16 w16cex w16sdtdh w16du">
+<w:styles xmlns:mc="http://schemas.openxmlformats.org/markup-compatibility/2006" xmlns:r="http://schemas.openxmlformats.org/officeDocument/2006/relationships" xmlns:w="http://schemas.openxmlformats.org/wordprocessingml/2006/main" xmlns:w14="http://schemas.microsoft.com/office/word/2010/wordml" xmlns:w15="http://schemas.microsoft.com/office/word/2012/wordml" xmlns:w16cex="http://schemas.microsoft.com/office/word/2018/wordml/cex" xmlns:w16cid="http://schemas.microsoft.com/office/word/2016/wordml/cid" xmlns:w16="http://schemas.microsoft.com/office/word/2018/wordml" xmlns:w16du="http://schemas.microsoft.com/office/word/2023/wordml/word16du" xmlns:w16sdtdh="http://schemas.microsoft.com/office/word/2020/wordml/sdtdatahash" xmlns:w16sdtfl="http://schemas.microsoft.com/office/word/2024/wordml/sdtformatlock" xmlns:w16se="http://schemas.microsoft.com/office/word/2015/wordml/symex" mc:Ignorable="w14 w15 w16se w16cid w16 w16cex w16sdtdh w16sdtfl w16du">
   <w:docDefaults>
     <w:rPrDefault>
       <w:rPr>
@@ -8717,6 +9181,7 @@
   <w:style w:type="paragraph" w:default="1" w:styleId="Normal">
     <w:name w:val="Normal"/>
     <w:qFormat/>
+    <w:rsid w:val="00397D2C"/>
   </w:style>
   <w:style w:type="paragraph" w:styleId="Titre1">
     <w:name w:val="heading 1"/>
@@ -8991,11 +9456,26 @@
       <w:lang w:val="en-US"/>
     </w:rPr>
   </w:style>
+  <w:style w:type="paragraph" w:styleId="Bibliographie">
+    <w:name w:val="Bibliography"/>
+    <w:basedOn w:val="Normal"/>
+    <w:next w:val="Normal"/>
+    <w:uiPriority w:val="37"/>
+    <w:unhideWhenUsed/>
+    <w:rsid w:val="00397D2C"/>
+    <w:pPr>
+      <w:tabs>
+        <w:tab w:val="left" w:pos="380"/>
+      </w:tabs>
+      <w:spacing w:after="0" w:line="240" w:lineRule="auto"/>
+      <w:ind w:left="384" w:hanging="384"/>
+    </w:pPr>
+  </w:style>
 </w:styles>
 </file>
 
 <file path=word/glossary/document.xml><?xml version="1.0" encoding="utf-8"?>
-<w:glossaryDocument xmlns:wpc="http://schemas.microsoft.com/office/word/2010/wordprocessingCanvas" xmlns:cx="http://schemas.microsoft.com/office/drawing/2014/chartex" xmlns:cx1="http://schemas.microsoft.com/office/drawing/2015/9/8/chartex" xmlns:cx2="http://schemas.microsoft.com/office/drawing/2015/10/21/chartex" xmlns:cx3="http://schemas.microsoft.com/office/drawing/2016/5/9/chartex" xmlns:cx4="http://schemas.microsoft.com/office/drawing/2016/5/10/chartex" xmlns:cx5="http://schemas.microsoft.com/office/drawing/2016/5/11/chartex" xmlns:cx6="http://schemas.microsoft.com/office/drawing/2016/5/12/chartex" xmlns:cx7="http://schemas.microsoft.com/office/drawing/2016/5/13/chartex" xmlns:cx8="http://schemas.microsoft.com/office/drawing/2016/5/14/chartex" xmlns:mc="http://schemas.openxmlformats.org/markup-compatibility/2006" xmlns:aink="http://schemas.microsoft.com/office/drawing/2016/ink" xmlns:am3d="http://schemas.microsoft.com/office/drawing/2017/model3d" xmlns:o="urn:schemas-microsoft-com:office:office" xmlns:oel="http://schemas.microsoft.com/office/2019/extlst" xmlns:r="http://schemas.openxmlformats.org/officeDocument/2006/relationships" xmlns:m="http://schemas.openxmlformats.org/officeDocument/2006/math" xmlns:v="urn:schemas-microsoft-com:vml" xmlns:wp14="http://schemas.microsoft.com/office/word/2010/wordprocessingDrawing" xmlns:wp="http://schemas.openxmlformats.org/drawingml/2006/wordprocessingDrawing" xmlns:w10="urn:schemas-microsoft-com:office:word" xmlns:w="http://schemas.openxmlformats.org/wordprocessingml/2006/main" xmlns:w14="http://schemas.microsoft.com/office/word/2010/wordml" xmlns:w15="http://schemas.microsoft.com/office/word/2012/wordml" xmlns:w16cex="http://schemas.microsoft.com/office/word/2018/wordml/cex" xmlns:w16cid="http://schemas.microsoft.com/office/word/2016/wordml/cid" xmlns:w16="http://schemas.microsoft.com/office/word/2018/wordml" xmlns:w16du="http://schemas.microsoft.com/office/word/2023/wordml/word16du" xmlns:w16sdtdh="http://schemas.microsoft.com/office/word/2020/wordml/sdtdatahash" xmlns:w16se="http://schemas.microsoft.com/office/word/2015/wordml/symex" xmlns:wpg="http://schemas.microsoft.com/office/word/2010/wordprocessingGroup" xmlns:wpi="http://schemas.microsoft.com/office/word/2010/wordprocessingInk" xmlns:wne="http://schemas.microsoft.com/office/word/2006/wordml" xmlns:wps="http://schemas.microsoft.com/office/word/2010/wordprocessingShape" mc:Ignorable="w14 w15 w16se w16cid w16 w16cex w16sdtdh w16du wp14">
+<w:glossaryDocument xmlns:wpc="http://schemas.microsoft.com/office/word/2010/wordprocessingCanvas" xmlns:cx="http://schemas.microsoft.com/office/drawing/2014/chartex" xmlns:cx1="http://schemas.microsoft.com/office/drawing/2015/9/8/chartex" xmlns:cx2="http://schemas.microsoft.com/office/drawing/2015/10/21/chartex" xmlns:cx3="http://schemas.microsoft.com/office/drawing/2016/5/9/chartex" xmlns:cx4="http://schemas.microsoft.com/office/drawing/2016/5/10/chartex" xmlns:cx5="http://schemas.microsoft.com/office/drawing/2016/5/11/chartex" xmlns:cx6="http://schemas.microsoft.com/office/drawing/2016/5/12/chartex" xmlns:cx7="http://schemas.microsoft.com/office/drawing/2016/5/13/chartex" xmlns:cx8="http://schemas.microsoft.com/office/drawing/2016/5/14/chartex" xmlns:mc="http://schemas.openxmlformats.org/markup-compatibility/2006" xmlns:aink="http://schemas.microsoft.com/office/drawing/2016/ink" xmlns:am3d="http://schemas.microsoft.com/office/drawing/2017/model3d" xmlns:o="urn:schemas-microsoft-com:office:office" xmlns:oel="http://schemas.microsoft.com/office/2019/extlst" xmlns:r="http://schemas.openxmlformats.org/officeDocument/2006/relationships" xmlns:m="http://schemas.openxmlformats.org/officeDocument/2006/math" xmlns:v="urn:schemas-microsoft-com:vml" xmlns:wp14="http://schemas.microsoft.com/office/word/2010/wordprocessingDrawing" xmlns:wp="http://schemas.openxmlformats.org/drawingml/2006/wordprocessingDrawing" xmlns:w10="urn:schemas-microsoft-com:office:word" xmlns:w="http://schemas.openxmlformats.org/wordprocessingml/2006/main" xmlns:w14="http://schemas.microsoft.com/office/word/2010/wordml" xmlns:w15="http://schemas.microsoft.com/office/word/2012/wordml" xmlns:w16cex="http://schemas.microsoft.com/office/word/2018/wordml/cex" xmlns:w16cid="http://schemas.microsoft.com/office/word/2016/wordml/cid" xmlns:w16="http://schemas.microsoft.com/office/word/2018/wordml" xmlns:w16du="http://schemas.microsoft.com/office/word/2023/wordml/word16du" xmlns:w16sdtdh="http://schemas.microsoft.com/office/word/2020/wordml/sdtdatahash" xmlns:w16sdtfl="http://schemas.microsoft.com/office/word/2024/wordml/sdtformatlock" xmlns:w16se="http://schemas.microsoft.com/office/word/2015/wordml/symex" xmlns:wpg="http://schemas.microsoft.com/office/word/2010/wordprocessingGroup" xmlns:wpi="http://schemas.microsoft.com/office/word/2010/wordprocessingInk" xmlns:wne="http://schemas.microsoft.com/office/word/2006/wordml" xmlns:wps="http://schemas.microsoft.com/office/word/2010/wordprocessingShape" mc:Ignorable="w14 w15 w16se w16cid w16 w16cex w16sdtdh w16sdtfl w16du wp14">
   <w:docParts>
     <w:docPart>
       <w:docPartPr>
@@ -9031,7 +9511,7 @@
 </file>
 
 <file path=word/glossary/fontTable.xml><?xml version="1.0" encoding="utf-8"?>
-<w:fonts xmlns:mc="http://schemas.openxmlformats.org/markup-compatibility/2006" xmlns:r="http://schemas.openxmlformats.org/officeDocument/2006/relationships" xmlns:w="http://schemas.openxmlformats.org/wordprocessingml/2006/main" xmlns:w14="http://schemas.microsoft.com/office/word/2010/wordml" xmlns:w15="http://schemas.microsoft.com/office/word/2012/wordml" xmlns:w16cex="http://schemas.microsoft.com/office/word/2018/wordml/cex" xmlns:w16cid="http://schemas.microsoft.com/office/word/2016/wordml/cid" xmlns:w16="http://schemas.microsoft.com/office/word/2018/wordml" xmlns:w16du="http://schemas.microsoft.com/office/word/2023/wordml/word16du" xmlns:w16sdtdh="http://schemas.microsoft.com/office/word/2020/wordml/sdtdatahash" xmlns:w16se="http://schemas.microsoft.com/office/word/2015/wordml/symex" mc:Ignorable="w14 w15 w16se w16cid w16 w16cex w16sdtdh w16du">
+<w:fonts xmlns:mc="http://schemas.openxmlformats.org/markup-compatibility/2006" xmlns:r="http://schemas.openxmlformats.org/officeDocument/2006/relationships" xmlns:w="http://schemas.openxmlformats.org/wordprocessingml/2006/main" xmlns:w14="http://schemas.microsoft.com/office/word/2010/wordml" xmlns:w15="http://schemas.microsoft.com/office/word/2012/wordml" xmlns:w16cex="http://schemas.microsoft.com/office/word/2018/wordml/cex" xmlns:w16cid="http://schemas.microsoft.com/office/word/2016/wordml/cid" xmlns:w16="http://schemas.microsoft.com/office/word/2018/wordml" xmlns:w16du="http://schemas.microsoft.com/office/word/2023/wordml/word16du" xmlns:w16sdtdh="http://schemas.microsoft.com/office/word/2020/wordml/sdtdatahash" xmlns:w16sdtfl="http://schemas.microsoft.com/office/word/2024/wordml/sdtformatlock" xmlns:w16se="http://schemas.microsoft.com/office/word/2015/wordml/symex" mc:Ignorable="w14 w15 w16se w16cid w16 w16cex w16sdtdh w16sdtfl w16du">
   <w:font w:name="Times New Roman">
     <w:panose1 w:val="02020603050405020304"/>
     <w:charset w:val="00"/>
@@ -9138,18 +9618,32 @@
     <w:pitch w:val="variable"/>
     <w:sig w:usb0="00000287" w:usb1="00000800" w:usb2="00000000" w:usb3="00000000" w:csb0="0000009F" w:csb1="00000000"/>
   </w:font>
-  <w:font w:name="Calibri Light">
-    <w:panose1 w:val="020F0302020204030204"/>
+  <w:font w:name="Cambria Math">
+    <w:panose1 w:val="02040503050406030204"/>
+    <w:charset w:val="00"/>
+    <w:family w:val="roman"/>
+    <w:pitch w:val="variable"/>
+    <w:sig w:usb0="E00002FF" w:usb1="420024FF" w:usb2="00000000" w:usb3="00000000" w:csb0="0000019F" w:csb1="00000000"/>
+  </w:font>
+  <w:font w:name="Aptos">
+    <w:panose1 w:val="020B0004020202020204"/>
     <w:charset w:val="00"/>
     <w:family w:val="swiss"/>
     <w:pitch w:val="variable"/>
-    <w:sig w:usb0="E4002EFF" w:usb1="C000247B" w:usb2="00000009" w:usb3="00000000" w:csb0="000001FF" w:csb1="00000000"/>
+    <w:sig w:usb0="20000287" w:usb1="00000003" w:usb2="00000000" w:usb3="00000000" w:csb0="0000019F" w:csb1="00000000"/>
+  </w:font>
+  <w:font w:name="Aptos Display">
+    <w:panose1 w:val="020B0004020202020204"/>
+    <w:charset w:val="00"/>
+    <w:family w:val="swiss"/>
+    <w:pitch w:val="variable"/>
+    <w:sig w:usb0="20000287" w:usb1="00000003" w:usb2="00000000" w:usb3="00000000" w:csb0="0000019F" w:csb1="00000000"/>
   </w:font>
 </w:fonts>
 </file>
 
 <file path=word/glossary/settings.xml><?xml version="1.0" encoding="utf-8"?>
-<w:settings xmlns:mc="http://schemas.openxmlformats.org/markup-compatibility/2006" xmlns:o="urn:schemas-microsoft-com:office:office" xmlns:r="http://schemas.openxmlformats.org/officeDocument/2006/relationships" xmlns:m="http://schemas.openxmlformats.org/officeDocument/2006/math" xmlns:v="urn:schemas-microsoft-com:vml" xmlns:w10="urn:schemas-microsoft-com:office:word" xmlns:w="http://schemas.openxmlformats.org/wordprocessingml/2006/main" xmlns:w14="http://schemas.microsoft.com/office/word/2010/wordml" xmlns:w15="http://schemas.microsoft.com/office/word/2012/wordml" xmlns:w16cex="http://schemas.microsoft.com/office/word/2018/wordml/cex" xmlns:w16cid="http://schemas.microsoft.com/office/word/2016/wordml/cid" xmlns:w16="http://schemas.microsoft.com/office/word/2018/wordml" xmlns:w16du="http://schemas.microsoft.com/office/word/2023/wordml/word16du" xmlns:w16sdtdh="http://schemas.microsoft.com/office/word/2020/wordml/sdtdatahash" xmlns:w16se="http://schemas.microsoft.com/office/word/2015/wordml/symex" xmlns:sl="http://schemas.openxmlformats.org/schemaLibrary/2006/main" mc:Ignorable="w14 w15 w16se w16cid w16 w16cex w16sdtdh w16du">
+<w:settings xmlns:mc="http://schemas.openxmlformats.org/markup-compatibility/2006" xmlns:o="urn:schemas-microsoft-com:office:office" xmlns:r="http://schemas.openxmlformats.org/officeDocument/2006/relationships" xmlns:m="http://schemas.openxmlformats.org/officeDocument/2006/math" xmlns:v="urn:schemas-microsoft-com:vml" xmlns:w10="urn:schemas-microsoft-com:office:word" xmlns:w="http://schemas.openxmlformats.org/wordprocessingml/2006/main" xmlns:w14="http://schemas.microsoft.com/office/word/2010/wordml" xmlns:w15="http://schemas.microsoft.com/office/word/2012/wordml" xmlns:w16cex="http://schemas.microsoft.com/office/word/2018/wordml/cex" xmlns:w16cid="http://schemas.microsoft.com/office/word/2016/wordml/cid" xmlns:w16="http://schemas.microsoft.com/office/word/2018/wordml" xmlns:w16du="http://schemas.microsoft.com/office/word/2023/wordml/word16du" xmlns:w16sdtdh="http://schemas.microsoft.com/office/word/2020/wordml/sdtdatahash" xmlns:w16sdtfl="http://schemas.microsoft.com/office/word/2024/wordml/sdtformatlock" xmlns:w16se="http://schemas.microsoft.com/office/word/2015/wordml/symex" xmlns:sl="http://schemas.openxmlformats.org/schemaLibrary/2006/main" mc:Ignorable="w14 w15 w16se w16cid w16 w16cex w16sdtdh w16sdtfl w16du">
   <w:view w:val="normal"/>
   <w:revisionView w:inkAnnotations="0"/>
   <w:defaultTabStop w:val="708"/>
@@ -9186,9 +9680,11 @@
     <w:rsid w:val="00BC11A3"/>
     <w:rsid w:val="00C10EA3"/>
     <w:rsid w:val="00C44A79"/>
+    <w:rsid w:val="00C62603"/>
     <w:rsid w:val="00CF096F"/>
     <w:rsid w:val="00D26DDA"/>
     <w:rsid w:val="00D34E39"/>
+    <w:rsid w:val="00DE4FC5"/>
     <w:rsid w:val="00EC08D1"/>
     <w:rsid w:val="00F43686"/>
     <w:rsid w:val="00FC069B"/>
@@ -9214,7 +9710,7 @@
 </file>
 
 <file path=word/glossary/styles.xml><?xml version="1.0" encoding="utf-8"?>
-<w:styles xmlns:mc="http://schemas.openxmlformats.org/markup-compatibility/2006" xmlns:r="http://schemas.openxmlformats.org/officeDocument/2006/relationships" xmlns:w="http://schemas.openxmlformats.org/wordprocessingml/2006/main" xmlns:w14="http://schemas.microsoft.com/office/word/2010/wordml" xmlns:w15="http://schemas.microsoft.com/office/word/2012/wordml" xmlns:w16cex="http://schemas.microsoft.com/office/word/2018/wordml/cex" xmlns:w16cid="http://schemas.microsoft.com/office/word/2016/wordml/cid" xmlns:w16="http://schemas.microsoft.com/office/word/2018/wordml" xmlns:w16du="http://schemas.microsoft.com/office/word/2023/wordml/word16du" xmlns:w16sdtdh="http://schemas.microsoft.com/office/word/2020/wordml/sdtdatahash" xmlns:w16se="http://schemas.microsoft.com/office/word/2015/wordml/symex" mc:Ignorable="w14 w15 w16se w16cid w16 w16cex w16sdtdh w16du">
+<w:styles xmlns:mc="http://schemas.openxmlformats.org/markup-compatibility/2006" xmlns:r="http://schemas.openxmlformats.org/officeDocument/2006/relationships" xmlns:w="http://schemas.openxmlformats.org/wordprocessingml/2006/main" xmlns:w14="http://schemas.microsoft.com/office/word/2010/wordml" xmlns:w15="http://schemas.microsoft.com/office/word/2012/wordml" xmlns:w16cex="http://schemas.microsoft.com/office/word/2018/wordml/cex" xmlns:w16cid="http://schemas.microsoft.com/office/word/2016/wordml/cid" xmlns:w16="http://schemas.microsoft.com/office/word/2018/wordml" xmlns:w16du="http://schemas.microsoft.com/office/word/2023/wordml/word16du" xmlns:w16sdtdh="http://schemas.microsoft.com/office/word/2020/wordml/sdtdatahash" xmlns:w16sdtfl="http://schemas.microsoft.com/office/word/2024/wordml/sdtformatlock" xmlns:w16se="http://schemas.microsoft.com/office/word/2015/wordml/symex" mc:Ignorable="w14 w15 w16se w16cid w16 w16cex w16sdtdh w16sdtfl w16du">
   <w:docDefaults>
     <w:rPrDefault>
       <w:rPr>
@@ -9664,7 +10160,7 @@
 </file>
 
 <file path=word/glossary/webSettings.xml><?xml version="1.0" encoding="utf-8"?>
-<w:webSettings xmlns:mc="http://schemas.openxmlformats.org/markup-compatibility/2006" xmlns:r="http://schemas.openxmlformats.org/officeDocument/2006/relationships" xmlns:w="http://schemas.openxmlformats.org/wordprocessingml/2006/main" xmlns:w14="http://schemas.microsoft.com/office/word/2010/wordml" xmlns:w15="http://schemas.microsoft.com/office/word/2012/wordml" xmlns:w16cex="http://schemas.microsoft.com/office/word/2018/wordml/cex" xmlns:w16cid="http://schemas.microsoft.com/office/word/2016/wordml/cid" xmlns:w16="http://schemas.microsoft.com/office/word/2018/wordml" xmlns:w16du="http://schemas.microsoft.com/office/word/2023/wordml/word16du" xmlns:w16sdtdh="http://schemas.microsoft.com/office/word/2020/wordml/sdtdatahash" xmlns:w16se="http://schemas.microsoft.com/office/word/2015/wordml/symex" mc:Ignorable="w14 w15 w16se w16cid w16 w16cex w16sdtdh w16du">
+<w:webSettings xmlns:mc="http://schemas.openxmlformats.org/markup-compatibility/2006" xmlns:r="http://schemas.openxmlformats.org/officeDocument/2006/relationships" xmlns:w="http://schemas.openxmlformats.org/wordprocessingml/2006/main" xmlns:w14="http://schemas.microsoft.com/office/word/2010/wordml" xmlns:w15="http://schemas.microsoft.com/office/word/2012/wordml" xmlns:w16cex="http://schemas.microsoft.com/office/word/2018/wordml/cex" xmlns:w16cid="http://schemas.microsoft.com/office/word/2016/wordml/cid" xmlns:w16="http://schemas.microsoft.com/office/word/2018/wordml" xmlns:w16du="http://schemas.microsoft.com/office/word/2023/wordml/word16du" xmlns:w16sdtdh="http://schemas.microsoft.com/office/word/2020/wordml/sdtdatahash" xmlns:w16sdtfl="http://schemas.microsoft.com/office/word/2024/wordml/sdtformatlock" xmlns:w16se="http://schemas.microsoft.com/office/word/2015/wordml/symex" mc:Ignorable="w14 w15 w16se w16cid w16 w16cex w16sdtdh w16sdtfl w16du">
   <w:optimizeForBrowser/>
   <w:allowPNG/>
 </w:webSettings>

</xml_diff>